<commit_message>
revised so many points before figures
</commit_message>
<xml_diff>
--- a/blind-review/戚笑景-评审意见答复及论文修改说明（硕士）.docx
+++ b/blind-review/戚笑景-评审意见答复及论文修改说明（硕士）.docx
@@ -137,7 +137,21 @@
         <w:rPr>
           <w:rFonts w:ascii="Times New Roman" w:eastAsia="宋体" w:hAnsi="Times New Roman" w:cs="Times New Roman" w:hint="eastAsia"/>
         </w:rPr>
-        <w:t>）提交给学位评定分委员会学位论</w:t>
+        <w:t>）提交给学位</w:t>
+      </w:r>
+      <w:proofErr w:type="gramStart"/>
+      <w:r>
+        <w:rPr>
+          <w:rFonts w:ascii="Times New Roman" w:eastAsia="宋体" w:hAnsi="Times New Roman" w:cs="Times New Roman" w:hint="eastAsia"/>
+        </w:rPr>
+        <w:t>评定分</w:t>
+      </w:r>
+      <w:proofErr w:type="gramEnd"/>
+      <w:r>
+        <w:rPr>
+          <w:rFonts w:ascii="Times New Roman" w:eastAsia="宋体" w:hAnsi="Times New Roman" w:cs="Times New Roman" w:hint="eastAsia"/>
+        </w:rPr>
+        <w:t>委员会学位论</w:t>
       </w:r>
       <w:r>
         <w:rPr>
@@ -370,6 +384,7 @@
               </w:rPr>
               <w:t xml:space="preserve"> </w:t>
             </w:r>
+            <w:proofErr w:type="gramStart"/>
             <w:r>
               <w:rPr>
                 <w:rFonts w:ascii="Times New Roman" w:eastAsia="宋体" w:hAnsi="Times New Roman" w:cs="Times New Roman" w:hint="eastAsia"/>
@@ -377,6 +392,7 @@
               </w:rPr>
               <w:t>戚笑景</w:t>
             </w:r>
+            <w:proofErr w:type="gramEnd"/>
           </w:p>
         </w:tc>
         <w:tc>
@@ -487,6 +503,7 @@
                 <w:szCs w:val="21"/>
               </w:rPr>
             </w:pPr>
+            <w:proofErr w:type="gramStart"/>
             <w:r>
               <w:rPr>
                 <w:rFonts w:ascii="Times New Roman" w:eastAsia="宋体" w:hAnsi="Times New Roman" w:cs="Times New Roman" w:hint="eastAsia"/>
@@ -494,6 +511,7 @@
               </w:rPr>
               <w:t>罗禹贡</w:t>
             </w:r>
+            <w:proofErr w:type="gramEnd"/>
           </w:p>
         </w:tc>
         <w:tc>
@@ -1982,7 +2000,23 @@
                 <w:rFonts w:ascii="Times New Roman" w:eastAsia="宋体" w:hAnsi="Times New Roman" w:cs="Times New Roman" w:hint="eastAsia"/>
                 <w:szCs w:val="21"/>
               </w:rPr>
-              <w:t>”，由于周车参数、意图和建模的不确定性以及车辆间交互导致的不确定性传播的复杂性，无需也难以做到“远距离（</w:t>
+              <w:t>”，</w:t>
+            </w:r>
+            <w:proofErr w:type="gramStart"/>
+            <w:r>
+              <w:rPr>
+                <w:rFonts w:ascii="Times New Roman" w:eastAsia="宋体" w:hAnsi="Times New Roman" w:cs="Times New Roman" w:hint="eastAsia"/>
+                <w:szCs w:val="21"/>
+              </w:rPr>
+              <w:t>由于周车参数</w:t>
+            </w:r>
+            <w:proofErr w:type="gramEnd"/>
+            <w:r>
+              <w:rPr>
+                <w:rFonts w:ascii="Times New Roman" w:eastAsia="宋体" w:hAnsi="Times New Roman" w:cs="Times New Roman" w:hint="eastAsia"/>
+                <w:szCs w:val="21"/>
+              </w:rPr>
+              <w:t>、意图和建模的不确定性以及车辆间交互导致的不确定性传播的复杂性，无需也难以做到“远距离（</w:t>
             </w:r>
             <w:r>
               <w:rPr>
@@ -2010,7 +2044,23 @@
                 <w:rFonts w:ascii="Times New Roman" w:eastAsia="宋体" w:hAnsi="Times New Roman" w:cs="Times New Roman" w:hint="eastAsia"/>
                 <w:szCs w:val="21"/>
               </w:rPr>
-              <w:t>数值范围的选择依据来源于高速上液罐车的允许行驶时速、长时域预测时间（本研究中云端预测</w:t>
+              <w:t>数值范围的选择依据来源于</w:t>
+            </w:r>
+            <w:proofErr w:type="gramStart"/>
+            <w:r>
+              <w:rPr>
+                <w:rFonts w:ascii="Times New Roman" w:eastAsia="宋体" w:hAnsi="Times New Roman" w:cs="Times New Roman" w:hint="eastAsia"/>
+                <w:szCs w:val="21"/>
+              </w:rPr>
+              <w:t>高速上</w:t>
+            </w:r>
+            <w:proofErr w:type="gramEnd"/>
+            <w:r>
+              <w:rPr>
+                <w:rFonts w:ascii="Times New Roman" w:eastAsia="宋体" w:hAnsi="Times New Roman" w:cs="Times New Roman" w:hint="eastAsia"/>
+                <w:szCs w:val="21"/>
+              </w:rPr>
+              <w:t>液罐车的允许行驶时速、长时域预测时间（本研究中云端预测</w:t>
             </w:r>
             <w:r>
               <w:rPr>
@@ -2024,7 +2074,23 @@
                 <w:rFonts w:ascii="Times New Roman" w:eastAsia="宋体" w:hAnsi="Times New Roman" w:cs="Times New Roman" w:hint="eastAsia"/>
                 <w:szCs w:val="21"/>
               </w:rPr>
-              <w:t>）及不同类型周车的行驶速度</w:t>
+              <w:t>）及不同</w:t>
+            </w:r>
+            <w:proofErr w:type="gramStart"/>
+            <w:r>
+              <w:rPr>
+                <w:rFonts w:ascii="Times New Roman" w:eastAsia="宋体" w:hAnsi="Times New Roman" w:cs="Times New Roman" w:hint="eastAsia"/>
+                <w:szCs w:val="21"/>
+              </w:rPr>
+              <w:t>类型周车</w:t>
+            </w:r>
+            <w:proofErr w:type="gramEnd"/>
+            <w:r>
+              <w:rPr>
+                <w:rFonts w:ascii="Times New Roman" w:eastAsia="宋体" w:hAnsi="Times New Roman" w:cs="Times New Roman" w:hint="eastAsia"/>
+                <w:szCs w:val="21"/>
+              </w:rPr>
+              <w:t>的行驶速度</w:t>
             </w:r>
             <w:r>
               <w:rPr>
@@ -2126,7 +2192,23 @@
                 <w:rFonts w:ascii="Times New Roman" w:eastAsia="宋体" w:hAnsi="Times New Roman" w:cs="Times New Roman" w:hint="eastAsia"/>
                 <w:szCs w:val="21"/>
               </w:rPr>
-              <w:t>左右，而云端需获取更大时域内的交通信息以为车端提供预测性决策建议，本文设置为</w:t>
+              <w:t>左右，而云端需获取更大时域内的交通信息以为</w:t>
+            </w:r>
+            <w:proofErr w:type="gramStart"/>
+            <w:r>
+              <w:rPr>
+                <w:rFonts w:ascii="Times New Roman" w:eastAsia="宋体" w:hAnsi="Times New Roman" w:cs="Times New Roman" w:hint="eastAsia"/>
+                <w:szCs w:val="21"/>
+              </w:rPr>
+              <w:t>车端提供</w:t>
+            </w:r>
+            <w:proofErr w:type="gramEnd"/>
+            <w:r>
+              <w:rPr>
+                <w:rFonts w:ascii="Times New Roman" w:eastAsia="宋体" w:hAnsi="Times New Roman" w:cs="Times New Roman" w:hint="eastAsia"/>
+                <w:szCs w:val="21"/>
+              </w:rPr>
+              <w:t>预测性决策建议，本文设置为</w:t>
             </w:r>
             <w:r>
               <w:rPr>
@@ -2210,7 +2292,23 @@
                 <w:rFonts w:ascii="Times New Roman" w:eastAsia="宋体" w:hAnsi="Times New Roman" w:cs="Times New Roman" w:hint="eastAsia"/>
                 <w:szCs w:val="21"/>
               </w:rPr>
-              <w:t>内自车和可能交互的所有周车的可达范围。在高速上，乘用车限速</w:t>
+              <w:t>内自车和可能交互的</w:t>
+            </w:r>
+            <w:proofErr w:type="gramStart"/>
+            <w:r>
+              <w:rPr>
+                <w:rFonts w:ascii="Times New Roman" w:eastAsia="宋体" w:hAnsi="Times New Roman" w:cs="Times New Roman" w:hint="eastAsia"/>
+                <w:szCs w:val="21"/>
+              </w:rPr>
+              <w:t>所有周车</w:t>
+            </w:r>
+            <w:proofErr w:type="gramEnd"/>
+            <w:r>
+              <w:rPr>
+                <w:rFonts w:ascii="Times New Roman" w:eastAsia="宋体" w:hAnsi="Times New Roman" w:cs="Times New Roman" w:hint="eastAsia"/>
+                <w:szCs w:val="21"/>
+              </w:rPr>
+              <w:t>的可达范围。在高速上，乘用车限速</w:t>
             </w:r>
             <w:r>
               <w:rPr>
@@ -2337,7 +2435,71 @@
                 <w:szCs w:val="21"/>
               </w:rPr>
               <w:lastRenderedPageBreak/>
-              <w:t>并不需要也难以做到，本研究通过图扩散模型表征周车风险与占据在不确定性存在的前提下如何扩散，并不是对于周车行为的精准预测，而是对风险演化的合理外推。随着时域、交互等扩散开的周车风险与占据用于为自车决策提供合理反馈，故对决策必要的是可能存在的</w:t>
+              <w:t>并不需要也难以做到，本研究通过图扩散模型</w:t>
+            </w:r>
+            <w:proofErr w:type="gramStart"/>
+            <w:r>
+              <w:rPr>
+                <w:rFonts w:ascii="Times New Roman" w:eastAsia="宋体" w:hAnsi="Times New Roman" w:cs="Times New Roman" w:hint="eastAsia"/>
+                <w:szCs w:val="21"/>
+              </w:rPr>
+              <w:t>表征周车风险</w:t>
+            </w:r>
+            <w:proofErr w:type="gramEnd"/>
+            <w:r>
+              <w:rPr>
+                <w:rFonts w:ascii="Times New Roman" w:eastAsia="宋体" w:hAnsi="Times New Roman" w:cs="Times New Roman" w:hint="eastAsia"/>
+                <w:szCs w:val="21"/>
+              </w:rPr>
+              <w:t>与占据在不确定性存在的前提下如何扩散，并不是对于周车行为的精准预测，而是对风险演化的合理外推。随着时域、</w:t>
+            </w:r>
+            <w:proofErr w:type="gramStart"/>
+            <w:r>
+              <w:rPr>
+                <w:rFonts w:ascii="Times New Roman" w:eastAsia="宋体" w:hAnsi="Times New Roman" w:cs="Times New Roman" w:hint="eastAsia"/>
+                <w:szCs w:val="21"/>
+              </w:rPr>
+              <w:t>交互等</w:t>
+            </w:r>
+            <w:proofErr w:type="gramEnd"/>
+            <w:r>
+              <w:rPr>
+                <w:rFonts w:ascii="Times New Roman" w:eastAsia="宋体" w:hAnsi="Times New Roman" w:cs="Times New Roman" w:hint="eastAsia"/>
+                <w:szCs w:val="21"/>
+              </w:rPr>
+              <w:t>扩散开的</w:t>
+            </w:r>
+            <w:proofErr w:type="gramStart"/>
+            <w:r>
+              <w:rPr>
+                <w:rFonts w:ascii="Times New Roman" w:eastAsia="宋体" w:hAnsi="Times New Roman" w:cs="Times New Roman" w:hint="eastAsia"/>
+                <w:szCs w:val="21"/>
+              </w:rPr>
+              <w:t>周车风险</w:t>
+            </w:r>
+            <w:proofErr w:type="gramEnd"/>
+            <w:r>
+              <w:rPr>
+                <w:rFonts w:ascii="Times New Roman" w:eastAsia="宋体" w:hAnsi="Times New Roman" w:cs="Times New Roman" w:hint="eastAsia"/>
+                <w:szCs w:val="21"/>
+              </w:rPr>
+              <w:t>与占据用于为自</w:t>
+            </w:r>
+            <w:proofErr w:type="gramStart"/>
+            <w:r>
+              <w:rPr>
+                <w:rFonts w:ascii="Times New Roman" w:eastAsia="宋体" w:hAnsi="Times New Roman" w:cs="Times New Roman" w:hint="eastAsia"/>
+                <w:szCs w:val="21"/>
+              </w:rPr>
+              <w:t>车决策</w:t>
+            </w:r>
+            <w:proofErr w:type="gramEnd"/>
+            <w:r>
+              <w:rPr>
+                <w:rFonts w:ascii="Times New Roman" w:eastAsia="宋体" w:hAnsi="Times New Roman" w:cs="Times New Roman" w:hint="eastAsia"/>
+                <w:szCs w:val="21"/>
+              </w:rPr>
+              <w:t>提供合理反馈，故对决策必要的是可能存在的</w:t>
             </w:r>
             <w:r>
               <w:rPr>
@@ -2723,8 +2885,17 @@
                 <w:rFonts w:ascii="Times New Roman" w:eastAsia="宋体" w:hAnsi="Times New Roman" w:cs="Times New Roman" w:hint="eastAsia"/>
                 <w:szCs w:val="21"/>
               </w:rPr>
-              <w:t>本研究在云端共训练</w:t>
-            </w:r>
+              <w:t>本研究在云端</w:t>
+            </w:r>
+            <w:proofErr w:type="gramStart"/>
+            <w:r>
+              <w:rPr>
+                <w:rFonts w:ascii="Times New Roman" w:eastAsia="宋体" w:hAnsi="Times New Roman" w:cs="Times New Roman" w:hint="eastAsia"/>
+                <w:szCs w:val="21"/>
+              </w:rPr>
+              <w:t>共训练</w:t>
+            </w:r>
+            <w:proofErr w:type="gramEnd"/>
             <w:r>
               <w:rPr>
                 <w:rFonts w:ascii="Times New Roman" w:eastAsia="宋体" w:hAnsi="Times New Roman" w:cs="Times New Roman" w:hint="eastAsia"/>
@@ -2737,7 +2908,23 @@
                 <w:rFonts w:ascii="Times New Roman" w:eastAsia="宋体" w:hAnsi="Times New Roman" w:cs="Times New Roman" w:hint="eastAsia"/>
                 <w:szCs w:val="21"/>
               </w:rPr>
-              <w:t>个智能体：图扩散交互式预测模型（世界模型）与长时域决策模型（决策器），前者通过监督学习训练，后者通过强化学习训练。对于决策器而言，其</w:t>
+              <w:t>个智能体：图扩散交互式预测模型（世界模型）与长时域决策模型（决策器），前者通过监督学习训练，后者通过强化学习训练。对于</w:t>
+            </w:r>
+            <w:proofErr w:type="gramStart"/>
+            <w:r>
+              <w:rPr>
+                <w:rFonts w:ascii="Times New Roman" w:eastAsia="宋体" w:hAnsi="Times New Roman" w:cs="Times New Roman" w:hint="eastAsia"/>
+                <w:szCs w:val="21"/>
+              </w:rPr>
+              <w:t>决策器</w:t>
+            </w:r>
+            <w:proofErr w:type="gramEnd"/>
+            <w:r>
+              <w:rPr>
+                <w:rFonts w:ascii="Times New Roman" w:eastAsia="宋体" w:hAnsi="Times New Roman" w:cs="Times New Roman" w:hint="eastAsia"/>
+                <w:szCs w:val="21"/>
+              </w:rPr>
+              <w:t>而言，其</w:t>
             </w:r>
             <w:r>
               <w:rPr>
@@ -2842,7 +3029,23 @@
                 <w:rFonts w:ascii="Times New Roman" w:eastAsia="宋体" w:hAnsi="Times New Roman" w:cs="Times New Roman" w:hint="eastAsia"/>
                 <w:szCs w:val="21"/>
               </w:rPr>
-              <w:t>思想，实际只取第一组量作为实际车端可能执行的量）</w:t>
+              <w:t>思想，实际只取第一组量作为</w:t>
+            </w:r>
+            <w:proofErr w:type="gramStart"/>
+            <w:r>
+              <w:rPr>
+                <w:rFonts w:ascii="Times New Roman" w:eastAsia="宋体" w:hAnsi="Times New Roman" w:cs="Times New Roman" w:hint="eastAsia"/>
+                <w:szCs w:val="21"/>
+              </w:rPr>
+              <w:t>实际车端可能</w:t>
+            </w:r>
+            <w:proofErr w:type="gramEnd"/>
+            <w:r>
+              <w:rPr>
+                <w:rFonts w:ascii="Times New Roman" w:eastAsia="宋体" w:hAnsi="Times New Roman" w:cs="Times New Roman" w:hint="eastAsia"/>
+                <w:szCs w:val="21"/>
+              </w:rPr>
+              <w:t>执行的量）</w:t>
             </w:r>
             <w:r>
               <w:rPr>
@@ -2858,6 +3061,7 @@
               </w:rPr>
               <w:t>图扩散模型作为</w:t>
             </w:r>
+            <w:proofErr w:type="gramStart"/>
             <w:r>
               <w:rPr>
                 <w:rFonts w:ascii="Times New Roman" w:eastAsia="宋体" w:hAnsi="Times New Roman" w:cs="Times New Roman" w:hint="eastAsia"/>
@@ -2872,6 +3076,7 @@
               </w:rPr>
               <w:t>训练</w:t>
             </w:r>
+            <w:proofErr w:type="gramEnd"/>
             <w:r>
               <w:rPr>
                 <w:rFonts w:ascii="Times New Roman" w:eastAsia="宋体" w:hAnsi="Times New Roman" w:cs="Times New Roman" w:hint="eastAsia"/>
@@ -2886,6 +3091,7 @@
               </w:rPr>
               <w:t>环境，在</w:t>
             </w:r>
+            <w:proofErr w:type="gramStart"/>
             <w:r>
               <w:rPr>
                 <w:rFonts w:ascii="Times New Roman" w:eastAsia="宋体" w:hAnsi="Times New Roman" w:cs="Times New Roman" w:hint="eastAsia"/>
@@ -2898,7 +3104,15 @@
                 <w:rFonts w:ascii="Times New Roman" w:eastAsia="宋体" w:hAnsi="Times New Roman" w:cs="Times New Roman" w:hint="eastAsia"/>
                 <w:szCs w:val="21"/>
               </w:rPr>
-              <w:t>训练阶段</w:t>
+              <w:t>训练</w:t>
+            </w:r>
+            <w:proofErr w:type="gramEnd"/>
+            <w:r>
+              <w:rPr>
+                <w:rFonts w:ascii="Times New Roman" w:eastAsia="宋体" w:hAnsi="Times New Roman" w:cs="Times New Roman" w:hint="eastAsia"/>
+                <w:szCs w:val="21"/>
+              </w:rPr>
+              <w:t>阶段</w:t>
             </w:r>
             <w:r>
               <w:rPr>
@@ -2919,7 +3133,39 @@
                 <w:rFonts w:ascii="Times New Roman" w:eastAsia="宋体" w:hAnsi="Times New Roman" w:cs="Times New Roman" w:hint="eastAsia"/>
                 <w:szCs w:val="21"/>
               </w:rPr>
-              <w:t>输入决策器生成的动作并反馈执行结果（自车占据与风险场演化为主要用到的内容）递推至给定时域</w:t>
+              <w:t>输入</w:t>
+            </w:r>
+            <w:proofErr w:type="gramStart"/>
+            <w:r>
+              <w:rPr>
+                <w:rFonts w:ascii="Times New Roman" w:eastAsia="宋体" w:hAnsi="Times New Roman" w:cs="Times New Roman" w:hint="eastAsia"/>
+                <w:szCs w:val="21"/>
+              </w:rPr>
+              <w:t>决策器</w:t>
+            </w:r>
+            <w:proofErr w:type="gramEnd"/>
+            <w:r>
+              <w:rPr>
+                <w:rFonts w:ascii="Times New Roman" w:eastAsia="宋体" w:hAnsi="Times New Roman" w:cs="Times New Roman" w:hint="eastAsia"/>
+                <w:szCs w:val="21"/>
+              </w:rPr>
+              <w:t>生成的动作并反馈执行结果（自车占据与</w:t>
+            </w:r>
+            <w:proofErr w:type="gramStart"/>
+            <w:r>
+              <w:rPr>
+                <w:rFonts w:ascii="Times New Roman" w:eastAsia="宋体" w:hAnsi="Times New Roman" w:cs="Times New Roman" w:hint="eastAsia"/>
+                <w:szCs w:val="21"/>
+              </w:rPr>
+              <w:t>风险场</w:t>
+            </w:r>
+            <w:proofErr w:type="gramEnd"/>
+            <w:r>
+              <w:rPr>
+                <w:rFonts w:ascii="Times New Roman" w:eastAsia="宋体" w:hAnsi="Times New Roman" w:cs="Times New Roman" w:hint="eastAsia"/>
+                <w:szCs w:val="21"/>
+              </w:rPr>
+              <w:t>演化为主要用到的内容）递推至给定时域</w:t>
             </w:r>
             <w:r>
               <w:rPr>
@@ -2954,7 +3200,55 @@
                 <w:rFonts w:ascii="Times New Roman" w:eastAsia="宋体" w:hAnsi="Times New Roman" w:cs="Times New Roman" w:hint="eastAsia"/>
                 <w:szCs w:val="21"/>
               </w:rPr>
-              <w:t>长时域强化学习的意义在于通过世界模型的长时域反馈引导决策器行为倾向于考虑长远未来下决策的收益并纳入图扩散世界模型中的不确定性预测，若决策器生成的决策将车辆引导至未来可能产生风险过度累积的状态，世界模型将反馈更多惩罚以引导其规避此类决策倾向。为进一步明确决策器输入输出维度，对表</w:t>
+              <w:t>长时域强化学习的意义在于通过世界模型的长时域反馈引导</w:t>
+            </w:r>
+            <w:proofErr w:type="gramStart"/>
+            <w:r>
+              <w:rPr>
+                <w:rFonts w:ascii="Times New Roman" w:eastAsia="宋体" w:hAnsi="Times New Roman" w:cs="Times New Roman" w:hint="eastAsia"/>
+                <w:szCs w:val="21"/>
+              </w:rPr>
+              <w:t>决策器</w:t>
+            </w:r>
+            <w:proofErr w:type="gramEnd"/>
+            <w:r>
+              <w:rPr>
+                <w:rFonts w:ascii="Times New Roman" w:eastAsia="宋体" w:hAnsi="Times New Roman" w:cs="Times New Roman" w:hint="eastAsia"/>
+                <w:szCs w:val="21"/>
+              </w:rPr>
+              <w:t>行为倾向于考虑长远未来下决策的收益并纳入图扩散世界模型中的不确定性预测，若</w:t>
+            </w:r>
+            <w:proofErr w:type="gramStart"/>
+            <w:r>
+              <w:rPr>
+                <w:rFonts w:ascii="Times New Roman" w:eastAsia="宋体" w:hAnsi="Times New Roman" w:cs="Times New Roman" w:hint="eastAsia"/>
+                <w:szCs w:val="21"/>
+              </w:rPr>
+              <w:t>决策器</w:t>
+            </w:r>
+            <w:proofErr w:type="gramEnd"/>
+            <w:r>
+              <w:rPr>
+                <w:rFonts w:ascii="Times New Roman" w:eastAsia="宋体" w:hAnsi="Times New Roman" w:cs="Times New Roman" w:hint="eastAsia"/>
+                <w:szCs w:val="21"/>
+              </w:rPr>
+              <w:t>生成的决策将车辆引导至未来可能产生风险过度累积的状态，世界模型将反馈更多惩罚以引导其规避此类决策倾向。为进一步明确</w:t>
+            </w:r>
+            <w:proofErr w:type="gramStart"/>
+            <w:r>
+              <w:rPr>
+                <w:rFonts w:ascii="Times New Roman" w:eastAsia="宋体" w:hAnsi="Times New Roman" w:cs="Times New Roman" w:hint="eastAsia"/>
+                <w:szCs w:val="21"/>
+              </w:rPr>
+              <w:t>决策器</w:t>
+            </w:r>
+            <w:proofErr w:type="gramEnd"/>
+            <w:r>
+              <w:rPr>
+                <w:rFonts w:ascii="Times New Roman" w:eastAsia="宋体" w:hAnsi="Times New Roman" w:cs="Times New Roman" w:hint="eastAsia"/>
+                <w:szCs w:val="21"/>
+              </w:rPr>
+              <w:t>输入输出维度，对表</w:t>
             </w:r>
             <w:r>
               <w:rPr>
@@ -3064,7 +3358,23 @@
                 <w:rFonts w:ascii="Times New Roman" w:eastAsia="宋体" w:hAnsi="Times New Roman" w:cs="Times New Roman" w:hint="eastAsia"/>
                 <w:szCs w:val="21"/>
               </w:rPr>
-              <w:t>节模型车试验结果分析中补充计算耗时与约束保持情况。</w:t>
+              <w:t>节模型</w:t>
+            </w:r>
+            <w:proofErr w:type="gramStart"/>
+            <w:r>
+              <w:rPr>
+                <w:rFonts w:ascii="Times New Roman" w:eastAsia="宋体" w:hAnsi="Times New Roman" w:cs="Times New Roman" w:hint="eastAsia"/>
+                <w:szCs w:val="21"/>
+              </w:rPr>
+              <w:t>车试验</w:t>
+            </w:r>
+            <w:proofErr w:type="gramEnd"/>
+            <w:r>
+              <w:rPr>
+                <w:rFonts w:ascii="Times New Roman" w:eastAsia="宋体" w:hAnsi="Times New Roman" w:cs="Times New Roman" w:hint="eastAsia"/>
+                <w:szCs w:val="21"/>
+              </w:rPr>
+              <w:t>结果分析中补充计算耗时与约束保持情况。</w:t>
             </w:r>
           </w:p>
         </w:tc>
@@ -3136,6 +3446,7 @@
                 <w:szCs w:val="21"/>
               </w:rPr>
             </w:pPr>
+            <w:bookmarkStart w:id="5" w:name="OLE_LINK3"/>
             <w:r>
               <w:rPr>
                 <w:rFonts w:ascii="Times New Roman" w:eastAsia="宋体" w:hAnsi="Times New Roman" w:cs="Times New Roman" w:hint="eastAsia"/>
@@ -3362,7 +3673,39 @@
                 <w:rFonts w:ascii="Times New Roman" w:eastAsia="宋体" w:hAnsi="Times New Roman" w:cs="Times New Roman"/>
                 <w:szCs w:val="21"/>
               </w:rPr>
-              <w:t>感谢您的宝贵意见。根据您关于摘要第一段逻辑性和歧义问题的建议，本文对摘要第一段进行了修改，在尽量保持原有篇幅的基础上，进一步明确了液罐车侧翻风险的研究背景，并将现有研究不足调整为</w:t>
+              <w:t>感谢您的宝贵意见。根据您关于</w:t>
+            </w:r>
+            <w:proofErr w:type="gramStart"/>
+            <w:r>
+              <w:rPr>
+                <w:rFonts w:ascii="Times New Roman" w:eastAsia="宋体" w:hAnsi="Times New Roman" w:cs="Times New Roman"/>
+                <w:szCs w:val="21"/>
+              </w:rPr>
+              <w:t>摘要第</w:t>
+            </w:r>
+            <w:proofErr w:type="gramEnd"/>
+            <w:r>
+              <w:rPr>
+                <w:rFonts w:ascii="Times New Roman" w:eastAsia="宋体" w:hAnsi="Times New Roman" w:cs="Times New Roman"/>
+                <w:szCs w:val="21"/>
+              </w:rPr>
+              <w:t>一段逻辑性和歧义问题的建议，本文对</w:t>
+            </w:r>
+            <w:proofErr w:type="gramStart"/>
+            <w:r>
+              <w:rPr>
+                <w:rFonts w:ascii="Times New Roman" w:eastAsia="宋体" w:hAnsi="Times New Roman" w:cs="Times New Roman"/>
+                <w:szCs w:val="21"/>
+              </w:rPr>
+              <w:t>摘要第</w:t>
+            </w:r>
+            <w:proofErr w:type="gramEnd"/>
+            <w:r>
+              <w:rPr>
+                <w:rFonts w:ascii="Times New Roman" w:eastAsia="宋体" w:hAnsi="Times New Roman" w:cs="Times New Roman"/>
+                <w:szCs w:val="21"/>
+              </w:rPr>
+              <w:t>一段进行了修改，在尽量保持原有篇幅的基础上，进一步明确了液罐车侧翻风险的研究背景，并将现有研究不足调整为</w:t>
             </w:r>
             <w:r>
               <w:rPr>
@@ -3712,7 +4055,23 @@
                 <w:rFonts w:ascii="Times New Roman" w:eastAsia="宋体" w:hAnsi="Times New Roman" w:cs="Times New Roman"/>
                 <w:szCs w:val="21"/>
               </w:rPr>
-              <w:t>等组合型缩写，已在首次出现处补充或完善含义说明，并在后文保持统一使用，从而降低缩略语嵌套带来的阅读负担。</w:t>
+              <w:t>等组合型缩写，已在首次出现处补充或完善含义说明，并在后</w:t>
+            </w:r>
+            <w:proofErr w:type="gramStart"/>
+            <w:r>
+              <w:rPr>
+                <w:rFonts w:ascii="Times New Roman" w:eastAsia="宋体" w:hAnsi="Times New Roman" w:cs="Times New Roman"/>
+                <w:szCs w:val="21"/>
+              </w:rPr>
+              <w:t>文保持</w:t>
+            </w:r>
+            <w:proofErr w:type="gramEnd"/>
+            <w:r>
+              <w:rPr>
+                <w:rFonts w:ascii="Times New Roman" w:eastAsia="宋体" w:hAnsi="Times New Roman" w:cs="Times New Roman"/>
+                <w:szCs w:val="21"/>
+              </w:rPr>
+              <w:t>统一使用，从而降低缩略语嵌套带来的阅读负担。</w:t>
             </w:r>
           </w:p>
           <w:p>
@@ -3773,6 +4132,281 @@
               </w:rPr>
               <w:t>说明：</w:t>
             </w:r>
+            <w:r>
+              <w:rPr>
+                <w:rFonts w:ascii="Times New Roman" w:eastAsia="宋体" w:hAnsi="Times New Roman" w:cs="Times New Roman"/>
+                <w:szCs w:val="21"/>
+              </w:rPr>
+              <w:t>感谢您的宝贵意见。根据该意见，本文对</w:t>
+            </w:r>
+            <w:r>
+              <w:rPr>
+                <w:rFonts w:ascii="Times New Roman" w:eastAsia="宋体" w:hAnsi="Times New Roman" w:cs="Times New Roman"/>
+                <w:szCs w:val="21"/>
+              </w:rPr>
+              <w:t>“</w:t>
+            </w:r>
+            <w:r>
+              <w:rPr>
+                <w:rFonts w:ascii="Times New Roman" w:eastAsia="宋体" w:hAnsi="Times New Roman" w:cs="Times New Roman"/>
+                <w:szCs w:val="21"/>
+              </w:rPr>
+              <w:t>符号和缩略语说明</w:t>
+            </w:r>
+            <w:r>
+              <w:rPr>
+                <w:rFonts w:ascii="Times New Roman" w:eastAsia="宋体" w:hAnsi="Times New Roman" w:cs="Times New Roman"/>
+                <w:szCs w:val="21"/>
+              </w:rPr>
+              <w:t>”</w:t>
+            </w:r>
+            <w:r>
+              <w:rPr>
+                <w:rFonts w:ascii="Times New Roman" w:eastAsia="宋体" w:hAnsi="Times New Roman" w:cs="Times New Roman"/>
+                <w:szCs w:val="21"/>
+              </w:rPr>
+              <w:t>部分进行了检查和调整。缩略语部分按英文字母顺序重新核对，修正了部分位置不当的条目，例如将</w:t>
+            </w:r>
+            <w:r>
+              <w:rPr>
+                <w:rFonts w:ascii="Times New Roman" w:eastAsia="宋体" w:hAnsi="Times New Roman" w:cs="Times New Roman"/>
+                <w:szCs w:val="21"/>
+              </w:rPr>
+              <w:t>A*</w:t>
+            </w:r>
+            <w:r>
+              <w:rPr>
+                <w:rFonts w:ascii="Times New Roman" w:eastAsia="宋体" w:hAnsi="Times New Roman" w:cs="Times New Roman"/>
+                <w:szCs w:val="21"/>
+              </w:rPr>
+              <w:t>调整至</w:t>
+            </w:r>
+            <w:r>
+              <w:rPr>
+                <w:rFonts w:ascii="Times New Roman" w:eastAsia="宋体" w:hAnsi="Times New Roman" w:cs="Times New Roman"/>
+                <w:szCs w:val="21"/>
+              </w:rPr>
+              <w:t>A</w:t>
+            </w:r>
+            <w:r>
+              <w:rPr>
+                <w:rFonts w:ascii="Times New Roman" w:eastAsia="宋体" w:hAnsi="Times New Roman" w:cs="Times New Roman"/>
+                <w:szCs w:val="21"/>
+              </w:rPr>
+              <w:t>类缩略语前部，将</w:t>
+            </w:r>
+            <w:r>
+              <w:rPr>
+                <w:rFonts w:ascii="Times New Roman" w:eastAsia="宋体" w:hAnsi="Times New Roman" w:cs="Times New Roman"/>
+                <w:szCs w:val="21"/>
+              </w:rPr>
+              <w:t>FCN</w:t>
+            </w:r>
+            <w:r>
+              <w:rPr>
+                <w:rFonts w:ascii="Times New Roman" w:eastAsia="宋体" w:hAnsi="Times New Roman" w:cs="Times New Roman"/>
+                <w:szCs w:val="21"/>
+              </w:rPr>
+              <w:t>、</w:t>
+            </w:r>
+            <w:r>
+              <w:rPr>
+                <w:rFonts w:ascii="Times New Roman" w:eastAsia="宋体" w:hAnsi="Times New Roman" w:cs="Times New Roman"/>
+                <w:szCs w:val="21"/>
+              </w:rPr>
+              <w:t>FFDL</w:t>
+            </w:r>
+            <w:r>
+              <w:rPr>
+                <w:rFonts w:ascii="Times New Roman" w:eastAsia="宋体" w:hAnsi="Times New Roman" w:cs="Times New Roman"/>
+                <w:szCs w:val="21"/>
+              </w:rPr>
+              <w:t>、</w:t>
+            </w:r>
+            <w:r>
+              <w:rPr>
+                <w:rFonts w:ascii="Times New Roman" w:eastAsia="宋体" w:hAnsi="Times New Roman" w:cs="Times New Roman"/>
+                <w:szCs w:val="21"/>
+              </w:rPr>
+              <w:t>FFN</w:t>
+            </w:r>
+            <w:r>
+              <w:rPr>
+                <w:rFonts w:ascii="Times New Roman" w:eastAsia="宋体" w:hAnsi="Times New Roman" w:cs="Times New Roman"/>
+                <w:szCs w:val="21"/>
+              </w:rPr>
+              <w:t>按字母顺序排列，将</w:t>
+            </w:r>
+            <w:r>
+              <w:rPr>
+                <w:rFonts w:ascii="Times New Roman" w:eastAsia="宋体" w:hAnsi="Times New Roman" w:cs="Times New Roman"/>
+                <w:szCs w:val="21"/>
+              </w:rPr>
+              <w:t>NAF</w:t>
+            </w:r>
+            <w:r>
+              <w:rPr>
+                <w:rFonts w:ascii="Times New Roman" w:eastAsia="宋体" w:hAnsi="Times New Roman" w:cs="Times New Roman"/>
+                <w:szCs w:val="21"/>
+              </w:rPr>
+              <w:t>、</w:t>
+            </w:r>
+            <w:r>
+              <w:rPr>
+                <w:rFonts w:ascii="Times New Roman" w:eastAsia="宋体" w:hAnsi="Times New Roman" w:cs="Times New Roman"/>
+                <w:szCs w:val="21"/>
+              </w:rPr>
+              <w:t>NAT</w:t>
+            </w:r>
+            <w:r>
+              <w:rPr>
+                <w:rFonts w:ascii="Times New Roman" w:eastAsia="宋体" w:hAnsi="Times New Roman" w:cs="Times New Roman"/>
+                <w:szCs w:val="21"/>
+              </w:rPr>
+              <w:t>以及</w:t>
+            </w:r>
+            <w:r>
+              <w:rPr>
+                <w:rFonts w:ascii="Times New Roman" w:eastAsia="宋体" w:hAnsi="Times New Roman" w:cs="Times New Roman"/>
+                <w:szCs w:val="21"/>
+              </w:rPr>
+              <w:t>RRT</w:t>
+            </w:r>
+            <w:r>
+              <w:rPr>
+                <w:rFonts w:ascii="Times New Roman" w:eastAsia="宋体" w:hAnsi="Times New Roman" w:cs="Times New Roman"/>
+                <w:szCs w:val="21"/>
+              </w:rPr>
+              <w:t>、</w:t>
+            </w:r>
+            <w:r>
+              <w:rPr>
+                <w:rFonts w:ascii="Times New Roman" w:eastAsia="宋体" w:hAnsi="Times New Roman" w:cs="Times New Roman"/>
+                <w:szCs w:val="21"/>
+              </w:rPr>
+              <w:t>RSU</w:t>
+            </w:r>
+            <w:r>
+              <w:rPr>
+                <w:rFonts w:ascii="Times New Roman" w:eastAsia="宋体" w:hAnsi="Times New Roman" w:cs="Times New Roman"/>
+                <w:szCs w:val="21"/>
+              </w:rPr>
+              <w:t>、</w:t>
+            </w:r>
+            <w:r>
+              <w:rPr>
+                <w:rFonts w:ascii="Times New Roman" w:eastAsia="宋体" w:hAnsi="Times New Roman" w:cs="Times New Roman"/>
+                <w:szCs w:val="21"/>
+              </w:rPr>
+              <w:t>RTK</w:t>
+            </w:r>
+            <w:r>
+              <w:rPr>
+                <w:rFonts w:ascii="Times New Roman" w:eastAsia="宋体" w:hAnsi="Times New Roman" w:cs="Times New Roman"/>
+                <w:szCs w:val="21"/>
+              </w:rPr>
+              <w:t>、</w:t>
+            </w:r>
+            <w:r>
+              <w:rPr>
+                <w:rFonts w:ascii="Times New Roman" w:eastAsia="宋体" w:hAnsi="Times New Roman" w:cs="Times New Roman"/>
+                <w:szCs w:val="21"/>
+              </w:rPr>
+              <w:t>RTTC</w:t>
+            </w:r>
+            <w:r>
+              <w:rPr>
+                <w:rFonts w:ascii="Times New Roman" w:eastAsia="宋体" w:hAnsi="Times New Roman" w:cs="Times New Roman"/>
+                <w:szCs w:val="21"/>
+              </w:rPr>
+              <w:t>、</w:t>
+            </w:r>
+            <w:r>
+              <w:rPr>
+                <w:rFonts w:ascii="Times New Roman" w:eastAsia="宋体" w:hAnsi="Times New Roman" w:cs="Times New Roman"/>
+                <w:szCs w:val="21"/>
+              </w:rPr>
+              <w:t>RTX</w:t>
+            </w:r>
+            <w:r>
+              <w:rPr>
+                <w:rFonts w:ascii="Times New Roman" w:eastAsia="宋体" w:hAnsi="Times New Roman" w:cs="Times New Roman"/>
+                <w:szCs w:val="21"/>
+              </w:rPr>
+              <w:t>等条目的顺序进行了规范。对于后续数学符号部分，本文保持</w:t>
+            </w:r>
+            <w:r>
+              <w:rPr>
+                <w:rFonts w:ascii="Times New Roman" w:eastAsia="宋体" w:hAnsi="Times New Roman" w:cs="Times New Roman"/>
+                <w:szCs w:val="21"/>
+              </w:rPr>
+              <w:t>“</w:t>
+            </w:r>
+            <w:r>
+              <w:rPr>
+                <w:rFonts w:ascii="Times New Roman" w:eastAsia="宋体" w:hAnsi="Times New Roman" w:cs="Times New Roman"/>
+                <w:szCs w:val="21"/>
+              </w:rPr>
+              <w:t>拉丁字母</w:t>
+            </w:r>
+            <w:r>
+              <w:rPr>
+                <w:rFonts w:ascii="Times New Roman" w:eastAsia="宋体" w:hAnsi="Times New Roman" w:cs="Times New Roman"/>
+                <w:szCs w:val="21"/>
+              </w:rPr>
+              <w:t>—</w:t>
+            </w:r>
+            <w:r>
+              <w:rPr>
+                <w:rFonts w:ascii="Times New Roman" w:eastAsia="宋体" w:hAnsi="Times New Roman" w:cs="Times New Roman"/>
+                <w:szCs w:val="21"/>
+              </w:rPr>
+              <w:t>希腊字母</w:t>
+            </w:r>
+            <w:r>
+              <w:rPr>
+                <w:rFonts w:ascii="Times New Roman" w:eastAsia="宋体" w:hAnsi="Times New Roman" w:cs="Times New Roman"/>
+                <w:szCs w:val="21"/>
+              </w:rPr>
+              <w:t>—</w:t>
+            </w:r>
+            <w:r>
+              <w:rPr>
+                <w:rFonts w:ascii="Times New Roman" w:eastAsia="宋体" w:hAnsi="Times New Roman" w:cs="Times New Roman"/>
+                <w:szCs w:val="21"/>
+              </w:rPr>
+              <w:t>特殊符号</w:t>
+            </w:r>
+            <w:r>
+              <w:rPr>
+                <w:rFonts w:ascii="Times New Roman" w:eastAsia="宋体" w:hAnsi="Times New Roman" w:cs="Times New Roman"/>
+                <w:szCs w:val="21"/>
+              </w:rPr>
+              <w:t>”</w:t>
+            </w:r>
+            <w:r>
+              <w:rPr>
+                <w:rFonts w:ascii="Times New Roman" w:eastAsia="宋体" w:hAnsi="Times New Roman" w:cs="Times New Roman"/>
+                <w:szCs w:val="21"/>
+              </w:rPr>
+              <w:t>的分类顺序，并进一步核对各</w:t>
+            </w:r>
+            <w:proofErr w:type="gramStart"/>
+            <w:r>
+              <w:rPr>
+                <w:rFonts w:ascii="Times New Roman" w:eastAsia="宋体" w:hAnsi="Times New Roman" w:cs="Times New Roman"/>
+                <w:szCs w:val="21"/>
+              </w:rPr>
+              <w:t>类内部</w:t>
+            </w:r>
+            <w:proofErr w:type="gramEnd"/>
+            <w:r>
+              <w:rPr>
+                <w:rFonts w:ascii="Times New Roman" w:eastAsia="宋体" w:hAnsi="Times New Roman" w:cs="Times New Roman"/>
+                <w:szCs w:val="21"/>
+              </w:rPr>
+              <w:t>排列，以提升符号索引的检索便利性。</w:t>
+            </w:r>
           </w:p>
           <w:p>
             <w:pPr>
@@ -3874,6 +4508,97 @@
               </w:rPr>
               <w:t>说明：</w:t>
             </w:r>
+            <w:r>
+              <w:rPr>
+                <w:rFonts w:ascii="Times New Roman" w:eastAsia="宋体" w:hAnsi="Times New Roman" w:cs="Times New Roman"/>
+                <w:szCs w:val="21"/>
+              </w:rPr>
+              <w:t>感谢您的宝贵意见。已根据意见对第</w:t>
+            </w:r>
+            <w:r>
+              <w:rPr>
+                <w:rFonts w:ascii="Times New Roman" w:eastAsia="宋体" w:hAnsi="Times New Roman" w:cs="Times New Roman"/>
+                <w:szCs w:val="21"/>
+              </w:rPr>
+              <w:t>1.1</w:t>
+            </w:r>
+            <w:r>
+              <w:rPr>
+                <w:rFonts w:ascii="Times New Roman" w:eastAsia="宋体" w:hAnsi="Times New Roman" w:cs="Times New Roman"/>
+                <w:szCs w:val="21"/>
+              </w:rPr>
+              <w:t>节第一段中的数字表达进行规范化修改，将</w:t>
+            </w:r>
+            <w:r>
+              <w:rPr>
+                <w:rFonts w:ascii="Times New Roman" w:eastAsia="宋体" w:hAnsi="Times New Roman" w:cs="Times New Roman"/>
+                <w:szCs w:val="21"/>
+              </w:rPr>
+              <w:t>“1</w:t>
+            </w:r>
+            <w:r>
+              <w:rPr>
+                <w:rFonts w:ascii="Times New Roman" w:eastAsia="宋体" w:hAnsi="Times New Roman" w:cs="Times New Roman"/>
+                <w:szCs w:val="21"/>
+              </w:rPr>
+              <w:t>万</w:t>
+            </w:r>
+            <w:r>
+              <w:rPr>
+                <w:rFonts w:ascii="Times New Roman" w:eastAsia="宋体" w:hAnsi="Times New Roman" w:cs="Times New Roman"/>
+                <w:szCs w:val="21"/>
+              </w:rPr>
+              <w:t>5</w:t>
+            </w:r>
+            <w:r>
+              <w:rPr>
+                <w:rFonts w:ascii="Times New Roman" w:eastAsia="宋体" w:hAnsi="Times New Roman" w:cs="Times New Roman"/>
+                <w:szCs w:val="21"/>
+              </w:rPr>
+              <w:t>千起</w:t>
+            </w:r>
+            <w:r>
+              <w:rPr>
+                <w:rFonts w:ascii="Times New Roman" w:eastAsia="宋体" w:hAnsi="Times New Roman" w:cs="Times New Roman"/>
+                <w:szCs w:val="21"/>
+              </w:rPr>
+              <w:t>”</w:t>
+            </w:r>
+            <w:r>
+              <w:rPr>
+                <w:rFonts w:ascii="Times New Roman" w:eastAsia="宋体" w:hAnsi="Times New Roman" w:cs="Times New Roman"/>
+                <w:szCs w:val="21"/>
+              </w:rPr>
+              <w:t>修改为</w:t>
+            </w:r>
+            <w:r>
+              <w:rPr>
+                <w:rFonts w:ascii="Times New Roman" w:eastAsia="宋体" w:hAnsi="Times New Roman" w:cs="Times New Roman"/>
+                <w:szCs w:val="21"/>
+              </w:rPr>
+              <w:t>“1.5</w:t>
+            </w:r>
+            <w:r>
+              <w:rPr>
+                <w:rFonts w:ascii="Times New Roman" w:eastAsia="宋体" w:hAnsi="Times New Roman" w:cs="Times New Roman"/>
+                <w:szCs w:val="21"/>
+              </w:rPr>
+              <w:t>万起</w:t>
+            </w:r>
+            <w:r>
+              <w:rPr>
+                <w:rFonts w:ascii="Times New Roman" w:eastAsia="宋体" w:hAnsi="Times New Roman" w:cs="Times New Roman"/>
+                <w:szCs w:val="21"/>
+              </w:rPr>
+              <w:t>”</w:t>
+            </w:r>
+            <w:r>
+              <w:rPr>
+                <w:rFonts w:ascii="Times New Roman" w:eastAsia="宋体" w:hAnsi="Times New Roman" w:cs="Times New Roman"/>
+                <w:szCs w:val="21"/>
+              </w:rPr>
+              <w:t>，避免阿拉伯数字与汉字数字混用，使表述更加符合学术论文写作规范。</w:t>
+            </w:r>
           </w:p>
           <w:p>
             <w:pPr>
@@ -3954,6 +4679,27 @@
               </w:rPr>
               <w:t>说明：</w:t>
             </w:r>
+            <w:r>
+              <w:rPr>
+                <w:rFonts w:ascii="Times New Roman" w:eastAsia="宋体" w:hAnsi="Times New Roman" w:cs="Times New Roman"/>
+                <w:szCs w:val="21"/>
+              </w:rPr>
+              <w:t>感谢您的宝贵意见。根据该意见，本文对全文图件与正文之间的引用关系进行了检查和规范，重点调整了第二章中部分图件在正文中的引用位置，尽量保证图件在正文中先被说明、再出现图示，并补充了缺失或不够明确的图号引用。关于图件绘制方式，部分架构图和流程图确实采用</w:t>
+            </w:r>
+            <w:r>
+              <w:rPr>
+                <w:rFonts w:ascii="Times New Roman" w:eastAsia="宋体" w:hAnsi="Times New Roman" w:cs="Times New Roman"/>
+                <w:szCs w:val="21"/>
+              </w:rPr>
+              <w:t>PPT</w:t>
+            </w:r>
+            <w:r>
+              <w:rPr>
+                <w:rFonts w:ascii="Times New Roman" w:eastAsia="宋体" w:hAnsi="Times New Roman" w:cs="Times New Roman"/>
+                <w:szCs w:val="21"/>
+              </w:rPr>
+              <w:t>绘制后导出。根据意见，本文已对相关图件的线条、字体、对齐方式、配色和整体版式进行重新打磨，使其表达更加规范、清晰和精美。</w:t>
+            </w:r>
           </w:p>
           <w:p>
             <w:pPr>
@@ -4020,6 +4766,388 @@
               </w:rPr>
               <w:t>说明：</w:t>
             </w:r>
+            <w:r>
+              <w:rPr>
+                <w:rFonts w:ascii="Times New Roman" w:eastAsia="宋体" w:hAnsi="Times New Roman" w:cs="Times New Roman"/>
+                <w:szCs w:val="21"/>
+              </w:rPr>
+              <w:t>感谢您的宝贵意见。根据该意见，本文对正文中英文缩写</w:t>
+            </w:r>
+            <w:proofErr w:type="gramStart"/>
+            <w:r>
+              <w:rPr>
+                <w:rFonts w:ascii="Times New Roman" w:eastAsia="宋体" w:hAnsi="Times New Roman" w:cs="Times New Roman"/>
+                <w:szCs w:val="21"/>
+              </w:rPr>
+              <w:t>词首次</w:t>
+            </w:r>
+            <w:proofErr w:type="gramEnd"/>
+            <w:r>
+              <w:rPr>
+                <w:rFonts w:ascii="Times New Roman" w:eastAsia="宋体" w:hAnsi="Times New Roman" w:cs="Times New Roman"/>
+                <w:szCs w:val="21"/>
+              </w:rPr>
+              <w:t>出现位置进行了检查，并补充了中文含义和英文全称。</w:t>
+            </w:r>
+            <w:proofErr w:type="gramStart"/>
+            <w:r>
+              <w:rPr>
+                <w:rFonts w:ascii="Times New Roman" w:eastAsia="宋体" w:hAnsi="Times New Roman" w:cs="Times New Roman"/>
+                <w:szCs w:val="21"/>
+              </w:rPr>
+              <w:t>除意见</w:t>
+            </w:r>
+            <w:proofErr w:type="gramEnd"/>
+            <w:r>
+              <w:rPr>
+                <w:rFonts w:ascii="Times New Roman" w:eastAsia="宋体" w:hAnsi="Times New Roman" w:cs="Times New Roman"/>
+                <w:szCs w:val="21"/>
+              </w:rPr>
+              <w:t>2-3</w:t>
+            </w:r>
+            <w:r>
+              <w:rPr>
+                <w:rFonts w:ascii="Times New Roman" w:eastAsia="宋体" w:hAnsi="Times New Roman" w:cs="Times New Roman"/>
+                <w:szCs w:val="21"/>
+              </w:rPr>
+              <w:t>中涉及的</w:t>
+            </w:r>
+            <w:r>
+              <w:rPr>
+                <w:rFonts w:ascii="Times New Roman" w:eastAsia="宋体" w:hAnsi="Times New Roman" w:cs="Times New Roman"/>
+                <w:szCs w:val="21"/>
+              </w:rPr>
+              <w:t>So-MBSoSE</w:t>
+            </w:r>
+            <w:r>
+              <w:rPr>
+                <w:rFonts w:ascii="Times New Roman" w:eastAsia="宋体" w:hAnsi="Times New Roman" w:cs="Times New Roman"/>
+                <w:szCs w:val="21"/>
+              </w:rPr>
+              <w:t>、</w:t>
+            </w:r>
+            <w:r>
+              <w:rPr>
+                <w:rFonts w:ascii="Times New Roman" w:eastAsia="宋体" w:hAnsi="Times New Roman" w:cs="Times New Roman"/>
+                <w:szCs w:val="21"/>
+              </w:rPr>
+              <w:t>CILQR</w:t>
+            </w:r>
+            <w:r>
+              <w:rPr>
+                <w:rFonts w:ascii="Times New Roman" w:eastAsia="宋体" w:hAnsi="Times New Roman" w:cs="Times New Roman"/>
+                <w:szCs w:val="21"/>
+              </w:rPr>
+              <w:t>、</w:t>
+            </w:r>
+            <w:r>
+              <w:rPr>
+                <w:rFonts w:ascii="Times New Roman" w:eastAsia="宋体" w:hAnsi="Times New Roman" w:cs="Times New Roman"/>
+                <w:szCs w:val="21"/>
+              </w:rPr>
+              <w:t>Trailer-MEI</w:t>
+            </w:r>
+            <w:r>
+              <w:rPr>
+                <w:rFonts w:ascii="Times New Roman" w:eastAsia="宋体" w:hAnsi="Times New Roman" w:cs="Times New Roman"/>
+                <w:szCs w:val="21"/>
+              </w:rPr>
+              <w:t>、</w:t>
+            </w:r>
+            <w:r>
+              <w:rPr>
+                <w:rFonts w:ascii="Times New Roman" w:eastAsia="宋体" w:hAnsi="Times New Roman" w:cs="Times New Roman"/>
+                <w:szCs w:val="21"/>
+              </w:rPr>
+              <w:t>PT+DB</w:t>
+            </w:r>
+            <w:r>
+              <w:rPr>
+                <w:rFonts w:ascii="Times New Roman" w:eastAsia="宋体" w:hAnsi="Times New Roman" w:cs="Times New Roman"/>
+                <w:szCs w:val="21"/>
+              </w:rPr>
+              <w:t>、</w:t>
+            </w:r>
+            <w:r>
+              <w:rPr>
+                <w:rFonts w:ascii="Times New Roman" w:eastAsia="宋体" w:hAnsi="Times New Roman" w:cs="Times New Roman"/>
+                <w:szCs w:val="21"/>
+              </w:rPr>
+              <w:t>ART+DB</w:t>
+            </w:r>
+            <w:r>
+              <w:rPr>
+                <w:rFonts w:ascii="Times New Roman" w:eastAsia="宋体" w:hAnsi="Times New Roman" w:cs="Times New Roman"/>
+                <w:szCs w:val="21"/>
+              </w:rPr>
+              <w:t>等缩写外，本文还对部分首次出现但说明不完整的缩写进行了完善。例如，在第一章中将</w:t>
+            </w:r>
+            <w:r>
+              <w:rPr>
+                <w:rFonts w:ascii="Times New Roman" w:eastAsia="宋体" w:hAnsi="Times New Roman" w:cs="Times New Roman"/>
+                <w:szCs w:val="21"/>
+              </w:rPr>
+              <w:t>A*</w:t>
+            </w:r>
+            <w:r>
+              <w:rPr>
+                <w:rFonts w:ascii="Times New Roman" w:eastAsia="宋体" w:hAnsi="Times New Roman" w:cs="Times New Roman"/>
+                <w:szCs w:val="21"/>
+              </w:rPr>
+              <w:t>、</w:t>
+            </w:r>
+            <w:r>
+              <w:rPr>
+                <w:rFonts w:ascii="Times New Roman" w:eastAsia="宋体" w:hAnsi="Times New Roman" w:cs="Times New Roman"/>
+                <w:szCs w:val="21"/>
+              </w:rPr>
+              <w:t>Hybrid A*</w:t>
+            </w:r>
+            <w:r>
+              <w:rPr>
+                <w:rFonts w:ascii="Times New Roman" w:eastAsia="宋体" w:hAnsi="Times New Roman" w:cs="Times New Roman"/>
+                <w:szCs w:val="21"/>
+              </w:rPr>
+              <w:t>、</w:t>
+            </w:r>
+            <w:r>
+              <w:rPr>
+                <w:rFonts w:ascii="Times New Roman" w:eastAsia="宋体" w:hAnsi="Times New Roman" w:cs="Times New Roman"/>
+                <w:szCs w:val="21"/>
+              </w:rPr>
+              <w:t>DP</w:t>
+            </w:r>
+            <w:r>
+              <w:rPr>
+                <w:rFonts w:ascii="Times New Roman" w:eastAsia="宋体" w:hAnsi="Times New Roman" w:cs="Times New Roman"/>
+                <w:szCs w:val="21"/>
+              </w:rPr>
+              <w:t>、</w:t>
+            </w:r>
+            <w:r>
+              <w:rPr>
+                <w:rFonts w:ascii="Times New Roman" w:eastAsia="宋体" w:hAnsi="Times New Roman" w:cs="Times New Roman"/>
+                <w:szCs w:val="21"/>
+              </w:rPr>
+              <w:t>PRM</w:t>
+            </w:r>
+            <w:r>
+              <w:rPr>
+                <w:rFonts w:ascii="Times New Roman" w:eastAsia="宋体" w:hAnsi="Times New Roman" w:cs="Times New Roman"/>
+                <w:szCs w:val="21"/>
+              </w:rPr>
+              <w:t>、</w:t>
+            </w:r>
+            <w:r>
+              <w:rPr>
+                <w:rFonts w:ascii="Times New Roman" w:eastAsia="宋体" w:hAnsi="Times New Roman" w:cs="Times New Roman"/>
+                <w:szCs w:val="21"/>
+              </w:rPr>
+              <w:t>RRT</w:t>
+            </w:r>
+            <w:r>
+              <w:rPr>
+                <w:rFonts w:ascii="Times New Roman" w:eastAsia="宋体" w:hAnsi="Times New Roman" w:cs="Times New Roman"/>
+                <w:szCs w:val="21"/>
+              </w:rPr>
+              <w:t>、</w:t>
+            </w:r>
+            <w:r>
+              <w:rPr>
+                <w:rFonts w:ascii="Times New Roman" w:eastAsia="宋体" w:hAnsi="Times New Roman" w:cs="Times New Roman"/>
+                <w:szCs w:val="21"/>
+              </w:rPr>
+              <w:t>LTR</w:t>
+            </w:r>
+            <w:r>
+              <w:rPr>
+                <w:rFonts w:ascii="Times New Roman" w:eastAsia="宋体" w:hAnsi="Times New Roman" w:cs="Times New Roman"/>
+                <w:szCs w:val="21"/>
+              </w:rPr>
+              <w:t>、</w:t>
+            </w:r>
+            <w:r>
+              <w:rPr>
+                <w:rFonts w:ascii="Times New Roman" w:eastAsia="宋体" w:hAnsi="Times New Roman" w:cs="Times New Roman"/>
+                <w:szCs w:val="21"/>
+              </w:rPr>
+              <w:t>TTR</w:t>
+            </w:r>
+            <w:r>
+              <w:rPr>
+                <w:rFonts w:ascii="Times New Roman" w:eastAsia="宋体" w:hAnsi="Times New Roman" w:cs="Times New Roman"/>
+                <w:szCs w:val="21"/>
+              </w:rPr>
+              <w:t>、</w:t>
+            </w:r>
+            <w:r>
+              <w:rPr>
+                <w:rFonts w:ascii="Times New Roman" w:eastAsia="宋体" w:hAnsi="Times New Roman" w:cs="Times New Roman"/>
+                <w:szCs w:val="21"/>
+              </w:rPr>
+              <w:t>Safe RL</w:t>
+            </w:r>
+            <w:r>
+              <w:rPr>
+                <w:rFonts w:ascii="Times New Roman" w:eastAsia="宋体" w:hAnsi="Times New Roman" w:cs="Times New Roman"/>
+                <w:szCs w:val="21"/>
+              </w:rPr>
+              <w:t>等规划与控制相关缩写补充为</w:t>
+            </w:r>
+            <w:r>
+              <w:rPr>
+                <w:rFonts w:ascii="Times New Roman" w:eastAsia="宋体" w:hAnsi="Times New Roman" w:cs="Times New Roman"/>
+                <w:szCs w:val="21"/>
+              </w:rPr>
+              <w:t>“</w:t>
+            </w:r>
+            <w:r>
+              <w:rPr>
+                <w:rFonts w:ascii="Times New Roman" w:eastAsia="宋体" w:hAnsi="Times New Roman" w:cs="Times New Roman"/>
+                <w:szCs w:val="21"/>
+              </w:rPr>
+              <w:t>中文术语</w:t>
+            </w:r>
+            <w:r>
+              <w:rPr>
+                <w:rFonts w:ascii="Times New Roman" w:eastAsia="宋体" w:hAnsi="Times New Roman" w:cs="Times New Roman"/>
+                <w:szCs w:val="21"/>
+              </w:rPr>
+              <w:t>+</w:t>
+            </w:r>
+            <w:r>
+              <w:rPr>
+                <w:rFonts w:ascii="Times New Roman" w:eastAsia="宋体" w:hAnsi="Times New Roman" w:cs="Times New Roman"/>
+                <w:szCs w:val="21"/>
+              </w:rPr>
+              <w:t>英文全称</w:t>
+            </w:r>
+            <w:r>
+              <w:rPr>
+                <w:rFonts w:ascii="Times New Roman" w:eastAsia="宋体" w:hAnsi="Times New Roman" w:cs="Times New Roman"/>
+                <w:szCs w:val="21"/>
+              </w:rPr>
+              <w:t>+</w:t>
+            </w:r>
+            <w:r>
+              <w:rPr>
+                <w:rFonts w:ascii="Times New Roman" w:eastAsia="宋体" w:hAnsi="Times New Roman" w:cs="Times New Roman"/>
+                <w:szCs w:val="21"/>
+              </w:rPr>
+              <w:t>缩写</w:t>
+            </w:r>
+            <w:r>
+              <w:rPr>
+                <w:rFonts w:ascii="Times New Roman" w:eastAsia="宋体" w:hAnsi="Times New Roman" w:cs="Times New Roman"/>
+                <w:szCs w:val="21"/>
+              </w:rPr>
+              <w:t>”</w:t>
+            </w:r>
+            <w:r>
+              <w:rPr>
+                <w:rFonts w:ascii="Times New Roman" w:eastAsia="宋体" w:hAnsi="Times New Roman" w:cs="Times New Roman"/>
+                <w:szCs w:val="21"/>
+              </w:rPr>
+              <w:t>的形式；将</w:t>
+            </w:r>
+            <w:r>
+              <w:rPr>
+                <w:rFonts w:ascii="Times New Roman" w:eastAsia="宋体" w:hAnsi="Times New Roman" w:cs="Times New Roman"/>
+                <w:szCs w:val="21"/>
+              </w:rPr>
+              <w:t>CVRIA</w:t>
+            </w:r>
+            <w:r>
+              <w:rPr>
+                <w:rFonts w:ascii="Times New Roman" w:eastAsia="宋体" w:hAnsi="Times New Roman" w:cs="Times New Roman"/>
+                <w:szCs w:val="21"/>
+              </w:rPr>
+              <w:t>、</w:t>
+            </w:r>
+            <w:r>
+              <w:rPr>
+                <w:rFonts w:ascii="Times New Roman" w:eastAsia="宋体" w:hAnsi="Times New Roman" w:cs="Times New Roman"/>
+                <w:szCs w:val="21"/>
+              </w:rPr>
+              <w:t>ARC-IT</w:t>
+            </w:r>
+            <w:r>
+              <w:rPr>
+                <w:rFonts w:ascii="Times New Roman" w:eastAsia="宋体" w:hAnsi="Times New Roman" w:cs="Times New Roman"/>
+                <w:szCs w:val="21"/>
+              </w:rPr>
+              <w:t>、</w:t>
+            </w:r>
+            <w:r>
+              <w:rPr>
+                <w:rFonts w:ascii="Times New Roman" w:eastAsia="宋体" w:hAnsi="Times New Roman" w:cs="Times New Roman"/>
+                <w:szCs w:val="21"/>
+              </w:rPr>
+              <w:t>C-ITS</w:t>
+            </w:r>
+            <w:r>
+              <w:rPr>
+                <w:rFonts w:ascii="Times New Roman" w:eastAsia="宋体" w:hAnsi="Times New Roman" w:cs="Times New Roman"/>
+                <w:szCs w:val="21"/>
+              </w:rPr>
+              <w:t>等体系架构相关缩写补充完整；在第三章中将</w:t>
+            </w:r>
+            <w:r>
+              <w:rPr>
+                <w:rFonts w:ascii="Times New Roman" w:eastAsia="宋体" w:hAnsi="Times New Roman" w:cs="Times New Roman"/>
+                <w:szCs w:val="21"/>
+              </w:rPr>
+              <w:t>BEV</w:t>
+            </w:r>
+            <w:r>
+              <w:rPr>
+                <w:rFonts w:ascii="Times New Roman" w:eastAsia="宋体" w:hAnsi="Times New Roman" w:cs="Times New Roman"/>
+                <w:szCs w:val="21"/>
+              </w:rPr>
+              <w:t>首次出现处补充为</w:t>
+            </w:r>
+            <w:r>
+              <w:rPr>
+                <w:rFonts w:ascii="Times New Roman" w:eastAsia="宋体" w:hAnsi="Times New Roman" w:cs="Times New Roman"/>
+                <w:szCs w:val="21"/>
+              </w:rPr>
+              <w:t>“</w:t>
+            </w:r>
+            <w:r>
+              <w:rPr>
+                <w:rFonts w:ascii="Times New Roman" w:eastAsia="宋体" w:hAnsi="Times New Roman" w:cs="Times New Roman"/>
+                <w:szCs w:val="21"/>
+              </w:rPr>
+              <w:t>鸟瞰图（</w:t>
+            </w:r>
+            <w:r>
+              <w:rPr>
+                <w:rFonts w:ascii="Times New Roman" w:eastAsia="宋体" w:hAnsi="Times New Roman" w:cs="Times New Roman"/>
+                <w:szCs w:val="21"/>
+              </w:rPr>
+              <w:t>Bird's-Eye View, BEV</w:t>
+            </w:r>
+            <w:r>
+              <w:rPr>
+                <w:rFonts w:ascii="Times New Roman" w:eastAsia="宋体" w:hAnsi="Times New Roman" w:cs="Times New Roman"/>
+                <w:szCs w:val="21"/>
+              </w:rPr>
+              <w:t>）</w:t>
+            </w:r>
+            <w:r>
+              <w:rPr>
+                <w:rFonts w:ascii="Times New Roman" w:eastAsia="宋体" w:hAnsi="Times New Roman" w:cs="Times New Roman"/>
+                <w:szCs w:val="21"/>
+              </w:rPr>
+              <w:t>”</w:t>
+            </w:r>
+            <w:r>
+              <w:rPr>
+                <w:rFonts w:ascii="Times New Roman" w:eastAsia="宋体" w:hAnsi="Times New Roman" w:cs="Times New Roman"/>
+                <w:szCs w:val="21"/>
+              </w:rPr>
+              <w:t>。同时，缩略语表中也对相关条目进行了同步核对和补充，以保证正文首次说明与缩略语表表述一致。</w:t>
+            </w:r>
           </w:p>
           <w:p>
             <w:pPr>
@@ -4068,7 +5196,15 @@
                 <w:rFonts w:ascii="Times New Roman" w:eastAsia="宋体" w:hAnsi="Times New Roman" w:cs="Times New Roman" w:hint="eastAsia"/>
                 <w:szCs w:val="21"/>
               </w:rPr>
-              <w:t>第二章部分内容，若是自己做的工作，就写清楚，不是自己做的，是不是放到第一章更好？</w:t>
+              <w:t>第二章部分内容，若是自己做的工作，就写清楚，不是自己做的，是不是放到第一章更</w:t>
+            </w:r>
+            <w:r>
+              <w:rPr>
+                <w:rFonts w:ascii="Times New Roman" w:eastAsia="宋体" w:hAnsi="Times New Roman" w:cs="Times New Roman" w:hint="eastAsia"/>
+                <w:szCs w:val="21"/>
+              </w:rPr>
+              <w:lastRenderedPageBreak/>
+              <w:t>好？</w:t>
             </w:r>
           </w:p>
           <w:p>
@@ -4085,6 +5221,83 @@
                 <w:szCs w:val="21"/>
               </w:rPr>
               <w:t>说明：</w:t>
+            </w:r>
+            <w:r>
+              <w:rPr>
+                <w:rFonts w:ascii="Times New Roman" w:eastAsia="宋体" w:hAnsi="Times New Roman" w:cs="Times New Roman"/>
+                <w:szCs w:val="21"/>
+              </w:rPr>
+              <w:t>感谢您的宝贵意见。第二章中车云协同液罐车防侧翻场景任务体系架构建模及其分析结论均为本文作者完成的研究工作。由于分场景基于模型与仿真的体系工程方法的通用元模型、视角裁剪和迭代流程已在作者前期发表于《机械工程学报》的论文中系统阐述，且根据其他专家意见和导师意见，论文正文对该部分进行了压缩处理，因此本文不再展开通用方法细节，而将重点放在</w:t>
+            </w:r>
+            <w:r>
+              <w:rPr>
+                <w:rFonts w:ascii="Times New Roman" w:eastAsia="宋体" w:hAnsi="Times New Roman" w:cs="Times New Roman"/>
+                <w:szCs w:val="21"/>
+              </w:rPr>
+              <w:t>CT2ROP</w:t>
+            </w:r>
+            <w:r>
+              <w:rPr>
+                <w:rFonts w:ascii="Times New Roman" w:eastAsia="宋体" w:hAnsi="Times New Roman" w:cs="Times New Roman"/>
+                <w:szCs w:val="21"/>
+              </w:rPr>
+              <w:t>场景任务架构的构建过程、车云端分工、服务参数约束及其对后续章节的约束传递关系上。在不增加篇幅的前提下，对第二章部分段落的逻辑衔接和图文引用顺序进行了梳理，使</w:t>
+            </w:r>
+            <w:r>
+              <w:rPr>
+                <w:rFonts w:ascii="Times New Roman" w:eastAsia="宋体" w:hAnsi="Times New Roman" w:cs="Times New Roman"/>
+                <w:szCs w:val="21"/>
+              </w:rPr>
+              <w:t>“</w:t>
+            </w:r>
+            <w:r>
+              <w:rPr>
+                <w:rFonts w:ascii="Times New Roman" w:eastAsia="宋体" w:hAnsi="Times New Roman" w:cs="Times New Roman"/>
+                <w:szCs w:val="21"/>
+              </w:rPr>
+              <w:t>方法来源</w:t>
+            </w:r>
+            <w:r>
+              <w:rPr>
+                <w:rFonts w:ascii="Times New Roman" w:eastAsia="宋体" w:hAnsi="Times New Roman" w:cs="Times New Roman"/>
+                <w:szCs w:val="21"/>
+              </w:rPr>
+              <w:t>—</w:t>
+            </w:r>
+            <w:r>
+              <w:rPr>
+                <w:rFonts w:ascii="Times New Roman" w:eastAsia="宋体" w:hAnsi="Times New Roman" w:cs="Times New Roman"/>
+                <w:szCs w:val="21"/>
+              </w:rPr>
+              <w:t>本文应用</w:t>
+            </w:r>
+            <w:r>
+              <w:rPr>
+                <w:rFonts w:ascii="Times New Roman" w:eastAsia="宋体" w:hAnsi="Times New Roman" w:cs="Times New Roman"/>
+                <w:szCs w:val="21"/>
+              </w:rPr>
+              <w:t>—</w:t>
+            </w:r>
+            <w:r>
+              <w:rPr>
+                <w:rFonts w:ascii="Times New Roman" w:eastAsia="宋体" w:hAnsi="Times New Roman" w:cs="Times New Roman"/>
+                <w:szCs w:val="21"/>
+              </w:rPr>
+              <w:t>后续章节约束</w:t>
+            </w:r>
+            <w:r>
+              <w:rPr>
+                <w:rFonts w:ascii="Times New Roman" w:eastAsia="宋体" w:hAnsi="Times New Roman" w:cs="Times New Roman"/>
+                <w:szCs w:val="21"/>
+              </w:rPr>
+              <w:t>”</w:t>
+            </w:r>
+            <w:r>
+              <w:rPr>
+                <w:rFonts w:ascii="Times New Roman" w:eastAsia="宋体" w:hAnsi="Times New Roman" w:cs="Times New Roman"/>
+                <w:szCs w:val="21"/>
+              </w:rPr>
+              <w:t>的关系更加清楚。</w:t>
             </w:r>
           </w:p>
           <w:p>
@@ -4166,6 +5379,155 @@
               </w:rPr>
               <w:t>说明：</w:t>
             </w:r>
+            <w:r>
+              <w:rPr>
+                <w:rFonts w:ascii="Times New Roman" w:eastAsia="宋体" w:hAnsi="Times New Roman" w:cs="Times New Roman"/>
+                <w:szCs w:val="21"/>
+              </w:rPr>
+              <w:t>感谢您的宝贵意见。根据该意见，本文对全文中部分过长语句和逻辑衔接不够清晰的段落进行了检查和修改，重点调整了第二章架构约束归纳、第三章车端防侧翻避障规划方法说明以及第</w:t>
+            </w:r>
+            <w:proofErr w:type="gramStart"/>
+            <w:r>
+              <w:rPr>
+                <w:rFonts w:ascii="Times New Roman" w:eastAsia="宋体" w:hAnsi="Times New Roman" w:cs="Times New Roman"/>
+                <w:szCs w:val="21"/>
+              </w:rPr>
+              <w:t>四章横纵向</w:t>
+            </w:r>
+            <w:proofErr w:type="gramEnd"/>
+            <w:r>
+              <w:rPr>
+                <w:rFonts w:ascii="Times New Roman" w:eastAsia="宋体" w:hAnsi="Times New Roman" w:cs="Times New Roman"/>
+                <w:szCs w:val="21"/>
+              </w:rPr>
+              <w:t>耦合液体晃动建模和试验结果分析等内容。例如，将第二章中关于</w:t>
+            </w:r>
+            <w:r>
+              <w:rPr>
+                <w:rFonts w:ascii="Times New Roman" w:eastAsia="宋体" w:hAnsi="Times New Roman" w:cs="Times New Roman"/>
+                <w:szCs w:val="21"/>
+              </w:rPr>
+              <w:t>“</w:t>
+            </w:r>
+            <w:r>
+              <w:rPr>
+                <w:rFonts w:ascii="Times New Roman" w:eastAsia="宋体" w:hAnsi="Times New Roman" w:cs="Times New Roman"/>
+                <w:szCs w:val="21"/>
+              </w:rPr>
+              <w:t>五类设计约束</w:t>
+            </w:r>
+            <w:r>
+              <w:rPr>
+                <w:rFonts w:ascii="Times New Roman" w:eastAsia="宋体" w:hAnsi="Times New Roman" w:cs="Times New Roman"/>
+                <w:szCs w:val="21"/>
+              </w:rPr>
+              <w:t>”</w:t>
+            </w:r>
+            <w:r>
+              <w:rPr>
+                <w:rFonts w:ascii="Times New Roman" w:eastAsia="宋体" w:hAnsi="Times New Roman" w:cs="Times New Roman"/>
+                <w:szCs w:val="21"/>
+              </w:rPr>
+              <w:t>的长句拆分为总体说明与分项说明；将第三章中</w:t>
+            </w:r>
+            <w:r>
+              <w:rPr>
+                <w:rFonts w:ascii="Times New Roman" w:eastAsia="宋体" w:hAnsi="Times New Roman" w:cs="Times New Roman"/>
+                <w:szCs w:val="21"/>
+              </w:rPr>
+              <w:t>“</w:t>
+            </w:r>
+            <w:r>
+              <w:rPr>
+                <w:rFonts w:ascii="Times New Roman" w:eastAsia="宋体" w:hAnsi="Times New Roman" w:cs="Times New Roman"/>
+                <w:szCs w:val="21"/>
+              </w:rPr>
+              <w:t>车端防侧翻规划与跟踪控制</w:t>
+            </w:r>
+            <w:r>
+              <w:rPr>
+                <w:rFonts w:ascii="Times New Roman" w:eastAsia="宋体" w:hAnsi="Times New Roman" w:cs="Times New Roman"/>
+                <w:szCs w:val="21"/>
+              </w:rPr>
+              <w:t>”</w:t>
+            </w:r>
+            <w:r>
+              <w:rPr>
+                <w:rFonts w:ascii="Times New Roman" w:eastAsia="宋体" w:hAnsi="Times New Roman" w:cs="Times New Roman"/>
+                <w:szCs w:val="21"/>
+              </w:rPr>
+              <w:t>相关段落重写为</w:t>
+            </w:r>
+            <w:r>
+              <w:rPr>
+                <w:rFonts w:ascii="Times New Roman" w:eastAsia="宋体" w:hAnsi="Times New Roman" w:cs="Times New Roman"/>
+                <w:szCs w:val="21"/>
+              </w:rPr>
+              <w:t>“</w:t>
+            </w:r>
+            <w:r>
+              <w:rPr>
+                <w:rFonts w:ascii="Times New Roman" w:eastAsia="宋体" w:hAnsi="Times New Roman" w:cs="Times New Roman"/>
+                <w:szCs w:val="21"/>
+              </w:rPr>
+              <w:t>规划</w:t>
+            </w:r>
+            <w:r>
+              <w:rPr>
+                <w:rFonts w:ascii="Times New Roman" w:eastAsia="宋体" w:hAnsi="Times New Roman" w:cs="Times New Roman"/>
+                <w:szCs w:val="21"/>
+              </w:rPr>
+              <w:t>—</w:t>
+            </w:r>
+            <w:r>
+              <w:rPr>
+                <w:rFonts w:ascii="Times New Roman" w:eastAsia="宋体" w:hAnsi="Times New Roman" w:cs="Times New Roman"/>
+                <w:szCs w:val="21"/>
+              </w:rPr>
+              <w:t>控制</w:t>
+            </w:r>
+            <w:r>
+              <w:rPr>
+                <w:rFonts w:ascii="Times New Roman" w:eastAsia="宋体" w:hAnsi="Times New Roman" w:cs="Times New Roman"/>
+                <w:szCs w:val="21"/>
+              </w:rPr>
+              <w:t>—</w:t>
+            </w:r>
+            <w:r>
+              <w:rPr>
+                <w:rFonts w:ascii="Times New Roman" w:eastAsia="宋体" w:hAnsi="Times New Roman" w:cs="Times New Roman"/>
+                <w:szCs w:val="21"/>
+              </w:rPr>
+              <w:t>牵挂避障协调</w:t>
+            </w:r>
+            <w:r>
+              <w:rPr>
+                <w:rFonts w:ascii="Times New Roman" w:eastAsia="宋体" w:hAnsi="Times New Roman" w:cs="Times New Roman"/>
+                <w:szCs w:val="21"/>
+              </w:rPr>
+              <w:t>—</w:t>
+            </w:r>
+            <w:r>
+              <w:rPr>
+                <w:rFonts w:ascii="Times New Roman" w:eastAsia="宋体" w:hAnsi="Times New Roman" w:cs="Times New Roman"/>
+                <w:szCs w:val="21"/>
+              </w:rPr>
+              <w:t>现有方法不足</w:t>
+            </w:r>
+            <w:r>
+              <w:rPr>
+                <w:rFonts w:ascii="Times New Roman" w:eastAsia="宋体" w:hAnsi="Times New Roman" w:cs="Times New Roman"/>
+                <w:szCs w:val="21"/>
+              </w:rPr>
+              <w:t>”</w:t>
+            </w:r>
+            <w:r>
+              <w:rPr>
+                <w:rFonts w:ascii="Times New Roman" w:eastAsia="宋体" w:hAnsi="Times New Roman" w:cs="Times New Roman"/>
+                <w:szCs w:val="21"/>
+              </w:rPr>
+              <w:t>的逻辑顺序；将第四章中二维晃动模型局限性和三维模型必要性的表述拆分为模型局限、实际三维动态和资源需求三层。通过上述修改，减少了单句承载的信息量，使段落内部逻辑关系更加清晰。</w:t>
+            </w:r>
           </w:p>
           <w:p>
             <w:pPr>
@@ -4232,6 +5594,171 @@
               </w:rPr>
               <w:t>说明：</w:t>
             </w:r>
+            <w:r>
+              <w:rPr>
+                <w:rFonts w:ascii="Times New Roman" w:eastAsia="宋体" w:hAnsi="Times New Roman" w:cs="Times New Roman"/>
+                <w:szCs w:val="21"/>
+              </w:rPr>
+              <w:t>感谢您的宝贵意见。经核查，原文中部分公式后的</w:t>
+            </w:r>
+            <w:r>
+              <w:rPr>
+                <w:rFonts w:ascii="Times New Roman" w:eastAsia="宋体" w:hAnsi="Times New Roman" w:cs="Times New Roman"/>
+                <w:szCs w:val="21"/>
+              </w:rPr>
+              <w:t>“</w:t>
+            </w:r>
+            <w:r>
+              <w:rPr>
+                <w:rFonts w:ascii="Times New Roman" w:eastAsia="宋体" w:hAnsi="Times New Roman" w:cs="Times New Roman"/>
+                <w:szCs w:val="21"/>
+              </w:rPr>
+              <w:t>其中</w:t>
+            </w:r>
+            <w:r>
+              <w:rPr>
+                <w:rFonts w:ascii="Times New Roman" w:eastAsia="宋体" w:hAnsi="Times New Roman" w:cs="Times New Roman"/>
+                <w:szCs w:val="21"/>
+              </w:rPr>
+              <w:t>”</w:t>
+            </w:r>
+            <w:r>
+              <w:rPr>
+                <w:rFonts w:ascii="Times New Roman" w:eastAsia="宋体" w:hAnsi="Times New Roman" w:cs="Times New Roman"/>
+                <w:szCs w:val="21"/>
+              </w:rPr>
+              <w:t>存在未顶格或后接标点不规范的问题。本文已对相关位置进行统一修改，在公式解释段落前增加顶格控制，并将表述规范为</w:t>
+            </w:r>
+            <w:r>
+              <w:rPr>
+                <w:rFonts w:ascii="Times New Roman" w:eastAsia="宋体" w:hAnsi="Times New Roman" w:cs="Times New Roman"/>
+                <w:szCs w:val="21"/>
+              </w:rPr>
+              <w:t>“</w:t>
+            </w:r>
+            <w:r>
+              <w:rPr>
+                <w:rFonts w:ascii="Times New Roman" w:eastAsia="宋体" w:hAnsi="Times New Roman" w:cs="Times New Roman"/>
+                <w:szCs w:val="21"/>
+              </w:rPr>
+              <w:t>其中，</w:t>
+            </w:r>
+            <w:r>
+              <w:rPr>
+                <w:rFonts w:ascii="Times New Roman" w:eastAsia="宋体" w:hAnsi="Times New Roman" w:cs="Times New Roman"/>
+                <w:szCs w:val="21"/>
+              </w:rPr>
+              <w:t>……”</w:t>
+            </w:r>
+            <w:r>
+              <w:rPr>
+                <w:rFonts w:ascii="Times New Roman" w:eastAsia="宋体" w:hAnsi="Times New Roman" w:cs="Times New Roman"/>
+                <w:szCs w:val="21"/>
+              </w:rPr>
+              <w:t>。例如，第三章中</w:t>
+            </w:r>
+            <w:r>
+              <w:rPr>
+                <w:rFonts w:ascii="Times New Roman" w:eastAsia="宋体" w:hAnsi="Times New Roman" w:cs="Times New Roman"/>
+                <w:szCs w:val="21"/>
+              </w:rPr>
+              <w:t>Graphflow</w:t>
+            </w:r>
+            <w:r>
+              <w:rPr>
+                <w:rFonts w:ascii="Times New Roman" w:eastAsia="宋体" w:hAnsi="Times New Roman" w:cs="Times New Roman"/>
+                <w:szCs w:val="21"/>
+              </w:rPr>
+              <w:t>模型、</w:t>
+            </w:r>
+            <w:r>
+              <w:rPr>
+                <w:rFonts w:ascii="Times New Roman" w:eastAsia="宋体" w:hAnsi="Times New Roman" w:cs="Times New Roman"/>
+                <w:szCs w:val="21"/>
+              </w:rPr>
+              <w:t>CILQR</w:t>
+            </w:r>
+            <w:r>
+              <w:rPr>
+                <w:rFonts w:ascii="Times New Roman" w:eastAsia="宋体" w:hAnsi="Times New Roman" w:cs="Times New Roman"/>
+                <w:szCs w:val="21"/>
+              </w:rPr>
+              <w:t>问题构造、</w:t>
+            </w:r>
+            <w:proofErr w:type="gramStart"/>
+            <w:r>
+              <w:rPr>
+                <w:rFonts w:ascii="Times New Roman" w:eastAsia="宋体" w:hAnsi="Times New Roman" w:cs="Times New Roman"/>
+                <w:szCs w:val="21"/>
+              </w:rPr>
+              <w:t>半挂液罐车</w:t>
+            </w:r>
+            <w:proofErr w:type="gramEnd"/>
+            <w:r>
+              <w:rPr>
+                <w:rFonts w:ascii="Times New Roman" w:eastAsia="宋体" w:hAnsi="Times New Roman" w:cs="Times New Roman"/>
+                <w:szCs w:val="21"/>
+              </w:rPr>
+              <w:t>简化运动动力学模型等公式后的说明均已按</w:t>
+            </w:r>
+            <w:r>
+              <w:rPr>
+                <w:rFonts w:ascii="Times New Roman" w:eastAsia="宋体" w:hAnsi="Times New Roman" w:cs="Times New Roman"/>
+                <w:szCs w:val="21"/>
+              </w:rPr>
+              <w:t>“</w:t>
+            </w:r>
+            <w:r>
+              <w:rPr>
+                <w:rFonts w:ascii="Times New Roman" w:eastAsia="宋体" w:hAnsi="Times New Roman" w:cs="Times New Roman"/>
+                <w:szCs w:val="21"/>
+              </w:rPr>
+              <w:t>其中，</w:t>
+            </w:r>
+            <w:r>
+              <w:rPr>
+                <w:rFonts w:ascii="Times New Roman" w:eastAsia="宋体" w:hAnsi="Times New Roman" w:cs="Times New Roman"/>
+                <w:szCs w:val="21"/>
+              </w:rPr>
+              <w:t>……”</w:t>
+            </w:r>
+            <w:r>
+              <w:rPr>
+                <w:rFonts w:ascii="Times New Roman" w:eastAsia="宋体" w:hAnsi="Times New Roman" w:cs="Times New Roman"/>
+                <w:szCs w:val="21"/>
+              </w:rPr>
+              <w:t>的形式顶格排版；第四章</w:t>
+            </w:r>
+            <w:proofErr w:type="gramStart"/>
+            <w:r>
+              <w:rPr>
+                <w:rFonts w:ascii="Times New Roman" w:eastAsia="宋体" w:hAnsi="Times New Roman" w:cs="Times New Roman"/>
+                <w:szCs w:val="21"/>
+              </w:rPr>
+              <w:t>中车液耦合</w:t>
+            </w:r>
+            <w:proofErr w:type="gramEnd"/>
+            <w:r>
+              <w:rPr>
+                <w:rFonts w:ascii="Times New Roman" w:eastAsia="宋体" w:hAnsi="Times New Roman" w:cs="Times New Roman"/>
+                <w:szCs w:val="21"/>
+              </w:rPr>
+              <w:t>模型、离散状态空间方程、</w:t>
+            </w:r>
+            <w:r>
+              <w:rPr>
+                <w:rFonts w:ascii="Times New Roman" w:eastAsia="宋体" w:hAnsi="Times New Roman" w:cs="Times New Roman"/>
+                <w:szCs w:val="21"/>
+              </w:rPr>
+              <w:t>MPC</w:t>
+            </w:r>
+            <w:r>
+              <w:rPr>
+                <w:rFonts w:ascii="Times New Roman" w:eastAsia="宋体" w:hAnsi="Times New Roman" w:cs="Times New Roman"/>
+                <w:szCs w:val="21"/>
+              </w:rPr>
+              <w:t>输出方程及代价函数等公式后的说明也进行了同类修改。修改后，公式说明段落的格式和标点更加统一。</w:t>
+            </w:r>
           </w:p>
           <w:p>
             <w:pPr>
@@ -4280,7 +5807,23 @@
                 <w:rFonts w:ascii="Times New Roman" w:eastAsia="宋体" w:hAnsi="Times New Roman" w:cs="Times New Roman" w:hint="eastAsia"/>
                 <w:szCs w:val="21"/>
               </w:rPr>
-              <w:t>文中的一些算法等，应加表号或图号，并在正文中加以引用。</w:t>
+              <w:t>文中的一些算法等，</w:t>
+            </w:r>
+            <w:proofErr w:type="gramStart"/>
+            <w:r>
+              <w:rPr>
+                <w:rFonts w:ascii="Times New Roman" w:eastAsia="宋体" w:hAnsi="Times New Roman" w:cs="Times New Roman" w:hint="eastAsia"/>
+                <w:szCs w:val="21"/>
+              </w:rPr>
+              <w:t>应加表号</w:t>
+            </w:r>
+            <w:proofErr w:type="gramEnd"/>
+            <w:r>
+              <w:rPr>
+                <w:rFonts w:ascii="Times New Roman" w:eastAsia="宋体" w:hAnsi="Times New Roman" w:cs="Times New Roman" w:hint="eastAsia"/>
+                <w:szCs w:val="21"/>
+              </w:rPr>
+              <w:t>或图号，并在正文中加以引用。</w:t>
             </w:r>
           </w:p>
           <w:p>
@@ -4297,6 +5840,255 @@
                 <w:szCs w:val="21"/>
               </w:rPr>
               <w:t>说明：</w:t>
+            </w:r>
+            <w:r>
+              <w:rPr>
+                <w:rFonts w:ascii="Times New Roman" w:eastAsia="宋体" w:hAnsi="Times New Roman" w:cs="Times New Roman"/>
+                <w:szCs w:val="21"/>
+              </w:rPr>
+              <w:t>感谢您的宝贵意见。本文已对算法、图表编号及正文引用关系进行了检查和补充。第三章中为</w:t>
+            </w:r>
+            <w:r>
+              <w:rPr>
+                <w:rFonts w:ascii="Times New Roman" w:eastAsia="宋体" w:hAnsi="Times New Roman" w:cs="Times New Roman"/>
+                <w:szCs w:val="21"/>
+              </w:rPr>
+              <w:t>Graphflow</w:t>
+            </w:r>
+            <w:r>
+              <w:rPr>
+                <w:rFonts w:ascii="Times New Roman" w:eastAsia="宋体" w:hAnsi="Times New Roman" w:cs="Times New Roman"/>
+                <w:szCs w:val="21"/>
+              </w:rPr>
+              <w:t>训练流程和基于</w:t>
+            </w:r>
+            <w:proofErr w:type="gramStart"/>
+            <w:r>
+              <w:rPr>
+                <w:rFonts w:ascii="Times New Roman" w:eastAsia="宋体" w:hAnsi="Times New Roman" w:cs="Times New Roman"/>
+                <w:szCs w:val="21"/>
+              </w:rPr>
+              <w:t>云端初</w:t>
+            </w:r>
+            <w:proofErr w:type="gramEnd"/>
+            <w:r>
+              <w:rPr>
+                <w:rFonts w:ascii="Times New Roman" w:eastAsia="宋体" w:hAnsi="Times New Roman" w:cs="Times New Roman"/>
+                <w:szCs w:val="21"/>
+              </w:rPr>
+              <w:t>解的防侧翻双场景应急避障规划流程补充了规范的算法标签，并在正文中分别增加</w:t>
+            </w:r>
+            <w:r>
+              <w:rPr>
+                <w:rFonts w:ascii="Times New Roman" w:eastAsia="宋体" w:hAnsi="Times New Roman" w:cs="Times New Roman"/>
+                <w:szCs w:val="21"/>
+              </w:rPr>
+              <w:t>“Graphflow</w:t>
+            </w:r>
+            <w:r>
+              <w:rPr>
+                <w:rFonts w:ascii="Times New Roman" w:eastAsia="宋体" w:hAnsi="Times New Roman" w:cs="Times New Roman"/>
+                <w:szCs w:val="21"/>
+              </w:rPr>
+              <w:t>模型的训练流程见算法</w:t>
+            </w:r>
+            <w:r>
+              <w:rPr>
+                <w:rFonts w:ascii="Times New Roman" w:eastAsia="宋体" w:hAnsi="Times New Roman" w:cs="Times New Roman"/>
+                <w:szCs w:val="21"/>
+              </w:rPr>
+              <w:t>……”</w:t>
+            </w:r>
+            <w:r>
+              <w:rPr>
+                <w:rFonts w:ascii="Times New Roman" w:eastAsia="宋体" w:hAnsi="Times New Roman" w:cs="Times New Roman"/>
+                <w:szCs w:val="21"/>
+              </w:rPr>
+              <w:t>和</w:t>
+            </w:r>
+            <w:r>
+              <w:rPr>
+                <w:rFonts w:ascii="Times New Roman" w:eastAsia="宋体" w:hAnsi="Times New Roman" w:cs="Times New Roman"/>
+                <w:szCs w:val="21"/>
+              </w:rPr>
+              <w:t>“</w:t>
+            </w:r>
+            <w:r>
+              <w:rPr>
+                <w:rFonts w:ascii="Times New Roman" w:eastAsia="宋体" w:hAnsi="Times New Roman" w:cs="Times New Roman"/>
+                <w:szCs w:val="21"/>
+              </w:rPr>
+              <w:t>防侧翻双场景应急避障规划流程见算法</w:t>
+            </w:r>
+            <w:r>
+              <w:rPr>
+                <w:rFonts w:ascii="Times New Roman" w:eastAsia="宋体" w:hAnsi="Times New Roman" w:cs="Times New Roman"/>
+                <w:szCs w:val="21"/>
+              </w:rPr>
+              <w:t>……”</w:t>
+            </w:r>
+            <w:r>
+              <w:rPr>
+                <w:rFonts w:ascii="Times New Roman" w:eastAsia="宋体" w:hAnsi="Times New Roman" w:cs="Times New Roman"/>
+                <w:szCs w:val="21"/>
+              </w:rPr>
+              <w:t>等引用说明；将原文中的</w:t>
+            </w:r>
+            <w:r>
+              <w:rPr>
+                <w:rFonts w:ascii="Times New Roman" w:eastAsia="宋体" w:hAnsi="Times New Roman" w:cs="Times New Roman"/>
+                <w:szCs w:val="21"/>
+              </w:rPr>
+              <w:t>“</w:t>
+            </w:r>
+            <w:r>
+              <w:rPr>
+                <w:rFonts w:ascii="Times New Roman" w:eastAsia="宋体" w:hAnsi="Times New Roman" w:cs="Times New Roman"/>
+                <w:szCs w:val="21"/>
+              </w:rPr>
+              <w:t>如图</w:t>
+            </w:r>
+            <w:r>
+              <w:rPr>
+                <w:rFonts w:ascii="Times New Roman" w:eastAsia="宋体" w:hAnsi="Times New Roman" w:cs="Times New Roman"/>
+                <w:szCs w:val="21"/>
+              </w:rPr>
+              <w:t>1</w:t>
+            </w:r>
+            <w:r>
+              <w:rPr>
+                <w:rFonts w:ascii="Times New Roman" w:eastAsia="宋体" w:hAnsi="Times New Roman" w:cs="Times New Roman"/>
+                <w:szCs w:val="21"/>
+              </w:rPr>
+              <w:t>所示</w:t>
+            </w:r>
+            <w:r>
+              <w:rPr>
+                <w:rFonts w:ascii="Times New Roman" w:eastAsia="宋体" w:hAnsi="Times New Roman" w:cs="Times New Roman"/>
+                <w:szCs w:val="21"/>
+              </w:rPr>
+              <w:t>”</w:t>
+            </w:r>
+            <w:r>
+              <w:rPr>
+                <w:rFonts w:ascii="Times New Roman" w:eastAsia="宋体" w:hAnsi="Times New Roman" w:cs="Times New Roman"/>
+                <w:szCs w:val="21"/>
+              </w:rPr>
+              <w:t>修改为对应</w:t>
+            </w:r>
+            <w:r>
+              <w:rPr>
+                <w:rFonts w:ascii="Times New Roman" w:eastAsia="宋体" w:hAnsi="Times New Roman" w:cs="Times New Roman"/>
+                <w:szCs w:val="21"/>
+              </w:rPr>
+              <w:t>“</w:t>
+            </w:r>
+            <w:r>
+              <w:rPr>
+                <w:rFonts w:ascii="Times New Roman" w:eastAsia="宋体" w:hAnsi="Times New Roman" w:cs="Times New Roman"/>
+                <w:szCs w:val="21"/>
+              </w:rPr>
+              <w:t>双场景规划示例说明</w:t>
+            </w:r>
+            <w:r>
+              <w:rPr>
+                <w:rFonts w:ascii="Times New Roman" w:eastAsia="宋体" w:hAnsi="Times New Roman" w:cs="Times New Roman"/>
+                <w:szCs w:val="21"/>
+              </w:rPr>
+              <w:t>”</w:t>
+            </w:r>
+            <w:r>
+              <w:rPr>
+                <w:rFonts w:ascii="Times New Roman" w:eastAsia="宋体" w:hAnsi="Times New Roman" w:cs="Times New Roman"/>
+                <w:szCs w:val="21"/>
+              </w:rPr>
+              <w:t>图的交叉引用；同时修正了仿真总得</w:t>
+            </w:r>
+            <w:proofErr w:type="gramStart"/>
+            <w:r>
+              <w:rPr>
+                <w:rFonts w:ascii="Times New Roman" w:eastAsia="宋体" w:hAnsi="Times New Roman" w:cs="Times New Roman"/>
+                <w:szCs w:val="21"/>
+              </w:rPr>
+              <w:t>分说明</w:t>
+            </w:r>
+            <w:proofErr w:type="gramEnd"/>
+            <w:r>
+              <w:rPr>
+                <w:rFonts w:ascii="Times New Roman" w:eastAsia="宋体" w:hAnsi="Times New Roman" w:cs="Times New Roman"/>
+                <w:szCs w:val="21"/>
+              </w:rPr>
+              <w:t>中图号引用不准确的问题，将其对应至</w:t>
+            </w:r>
+            <w:r>
+              <w:rPr>
+                <w:rFonts w:ascii="Times New Roman" w:eastAsia="宋体" w:hAnsi="Times New Roman" w:cs="Times New Roman"/>
+                <w:szCs w:val="21"/>
+              </w:rPr>
+              <w:t>“</w:t>
+            </w:r>
+            <w:r>
+              <w:rPr>
+                <w:rFonts w:ascii="Times New Roman" w:eastAsia="宋体" w:hAnsi="Times New Roman" w:cs="Times New Roman"/>
+                <w:szCs w:val="21"/>
+              </w:rPr>
+              <w:t>交通流验证集仿真总得分情况对比</w:t>
+            </w:r>
+            <w:r>
+              <w:rPr>
+                <w:rFonts w:ascii="Times New Roman" w:eastAsia="宋体" w:hAnsi="Times New Roman" w:cs="Times New Roman"/>
+                <w:szCs w:val="21"/>
+              </w:rPr>
+              <w:t>”</w:t>
+            </w:r>
+            <w:r>
+              <w:rPr>
+                <w:rFonts w:ascii="Times New Roman" w:eastAsia="宋体" w:hAnsi="Times New Roman" w:cs="Times New Roman"/>
+                <w:szCs w:val="21"/>
+              </w:rPr>
+              <w:t>图。此外，对部分</w:t>
+            </w:r>
+            <w:r>
+              <w:rPr>
+                <w:rFonts w:ascii="Times New Roman" w:eastAsia="宋体" w:hAnsi="Times New Roman" w:cs="Times New Roman"/>
+                <w:szCs w:val="21"/>
+              </w:rPr>
+              <w:t>“</w:t>
+            </w:r>
+            <w:r>
+              <w:rPr>
+                <w:rFonts w:ascii="Times New Roman" w:eastAsia="宋体" w:hAnsi="Times New Roman" w:cs="Times New Roman"/>
+                <w:szCs w:val="21"/>
+              </w:rPr>
+              <w:t>如图</w:t>
+            </w:r>
+            <w:r>
+              <w:rPr>
+                <w:rFonts w:ascii="Times New Roman" w:eastAsia="宋体" w:hAnsi="Times New Roman" w:cs="Times New Roman"/>
+                <w:szCs w:val="21"/>
+              </w:rPr>
+              <w:t>……”“</w:t>
+            </w:r>
+            <w:r>
+              <w:rPr>
+                <w:rFonts w:ascii="Times New Roman" w:eastAsia="宋体" w:hAnsi="Times New Roman" w:cs="Times New Roman"/>
+                <w:szCs w:val="21"/>
+              </w:rPr>
+              <w:t>图</w:t>
+            </w:r>
+            <w:r>
+              <w:rPr>
+                <w:rFonts w:ascii="Times New Roman" w:eastAsia="宋体" w:hAnsi="Times New Roman" w:cs="Times New Roman"/>
+                <w:szCs w:val="21"/>
+              </w:rPr>
+              <w:t>……”</w:t>
+            </w:r>
+            <w:r>
+              <w:rPr>
+                <w:rFonts w:ascii="Times New Roman" w:eastAsia="宋体" w:hAnsi="Times New Roman" w:cs="Times New Roman"/>
+                <w:szCs w:val="21"/>
+              </w:rPr>
+              <w:t>等写法进行了统一规范，使图、表、算法均尽量在正文中以编号形式明确引用。</w:t>
             </w:r>
           </w:p>
           <w:p>
@@ -4341,12 +6133,21 @@
               </w:rPr>
               <w:t>：</w:t>
             </w:r>
-            <w:r>
-              <w:rPr>
-                <w:rFonts w:ascii="Times New Roman" w:eastAsia="宋体" w:hAnsi="Times New Roman" w:cs="Times New Roman" w:hint="eastAsia"/>
-                <w:szCs w:val="21"/>
-              </w:rPr>
-              <w:t>一些图的坐标轴名称的字号比正文字号大。</w:t>
+            <w:proofErr w:type="gramStart"/>
+            <w:r>
+              <w:rPr>
+                <w:rFonts w:ascii="Times New Roman" w:eastAsia="宋体" w:hAnsi="Times New Roman" w:cs="Times New Roman" w:hint="eastAsia"/>
+                <w:szCs w:val="21"/>
+              </w:rPr>
+              <w:t>一些图</w:t>
+            </w:r>
+            <w:proofErr w:type="gramEnd"/>
+            <w:r>
+              <w:rPr>
+                <w:rFonts w:ascii="Times New Roman" w:eastAsia="宋体" w:hAnsi="Times New Roman" w:cs="Times New Roman" w:hint="eastAsia"/>
+                <w:szCs w:val="21"/>
+              </w:rPr>
+              <w:t>的坐标轴名称的字号比正文字号大。</w:t>
             </w:r>
           </w:p>
           <w:p>
@@ -4365,20 +6166,21 @@
               <w:t>说明：</w:t>
             </w:r>
           </w:p>
-          <w:p>
-            <w:pPr>
-              <w:spacing w:beforeLines="20" w:before="62" w:afterLines="20" w:after="62"/>
-              <w:rPr>
-                <w:rFonts w:ascii="Times New Roman" w:eastAsia="宋体" w:hAnsi="Times New Roman" w:cs="Times New Roman" w:hint="eastAsia"/>
-                <w:szCs w:val="21"/>
-              </w:rPr>
-            </w:pPr>
-          </w:p>
-          <w:p>
-            <w:pPr>
-              <w:spacing w:beforeLines="20" w:before="62" w:afterLines="20" w:after="62"/>
-              <w:rPr>
-                <w:rFonts w:ascii="Times New Roman" w:eastAsia="宋体" w:hAnsi="Times New Roman" w:cs="Times New Roman" w:hint="eastAsia"/>
+          <w:bookmarkEnd w:id="5"/>
+          <w:p>
+            <w:pPr>
+              <w:spacing w:beforeLines="20" w:before="62" w:afterLines="20" w:after="62"/>
+              <w:rPr>
+                <w:rFonts w:ascii="Times New Roman" w:eastAsia="宋体" w:hAnsi="Times New Roman" w:cs="Times New Roman"/>
+                <w:szCs w:val="21"/>
+              </w:rPr>
+            </w:pPr>
+          </w:p>
+          <w:p>
+            <w:pPr>
+              <w:spacing w:beforeLines="20" w:before="62" w:afterLines="20" w:after="62"/>
+              <w:rPr>
+                <w:rFonts w:ascii="Times New Roman" w:eastAsia="宋体" w:hAnsi="Times New Roman" w:cs="Times New Roman"/>
                 <w:szCs w:val="21"/>
               </w:rPr>
             </w:pPr>
@@ -4475,7 +6277,6 @@
                 <w:b/>
                 <w:szCs w:val="21"/>
               </w:rPr>
-              <w:lastRenderedPageBreak/>
               <w:t>意见</w:t>
             </w:r>
             <w:r>
@@ -4566,7 +6367,7 @@
               </w:tabs>
               <w:spacing w:beforeLines="20" w:before="62" w:afterLines="20" w:after="62"/>
               <w:rPr>
-                <w:rFonts w:ascii="Times New Roman" w:eastAsia="宋体" w:hAnsi="Times New Roman" w:cs="Times New Roman" w:hint="eastAsia"/>
+                <w:rFonts w:ascii="Times New Roman" w:eastAsia="宋体" w:hAnsi="Times New Roman" w:cs="Times New Roman"/>
                 <w:szCs w:val="21"/>
               </w:rPr>
             </w:pPr>
@@ -4601,6 +6402,7 @@
                 <w:sz w:val="24"/>
                 <w:szCs w:val="24"/>
               </w:rPr>
+              <w:lastRenderedPageBreak/>
               <w:t>（1）参见指南添加学位论文使用授权说明页</w:t>
             </w:r>
           </w:p>
@@ -4669,7 +6471,7 @@
               </w:tabs>
               <w:spacing w:beforeLines="20" w:before="62" w:afterLines="20" w:after="62"/>
               <w:rPr>
-                <w:rFonts w:ascii="Times New Roman" w:eastAsia="宋体" w:hAnsi="Times New Roman" w:cs="Times New Roman" w:hint="eastAsia"/>
+                <w:rFonts w:ascii="Times New Roman" w:eastAsia="宋体" w:hAnsi="Times New Roman" w:cs="Times New Roman"/>
                 <w:b/>
                 <w:szCs w:val="21"/>
               </w:rPr>
@@ -4680,7 +6482,43 @@
                 <w:sz w:val="24"/>
                 <w:szCs w:val="24"/>
               </w:rPr>
-              <w:t>（4）全文校对，应删除图片中无意义的外边框，如果有分图应列写各个分图题，且分图题应位于图下方，如P</w:t>
+              <w:t>（4）全文校对，应删除图片中无意义的外边框，如果有分图应列</w:t>
+            </w:r>
+            <w:proofErr w:type="gramStart"/>
+            <w:r>
+              <w:rPr>
+                <w:rFonts w:ascii="宋体" w:eastAsia="宋体" w:hAnsi="宋体" w:hint="eastAsia"/>
+                <w:sz w:val="24"/>
+                <w:szCs w:val="24"/>
+              </w:rPr>
+              <w:t>写各个</w:t>
+            </w:r>
+            <w:proofErr w:type="gramEnd"/>
+            <w:r>
+              <w:rPr>
+                <w:rFonts w:ascii="宋体" w:eastAsia="宋体" w:hAnsi="宋体" w:hint="eastAsia"/>
+                <w:sz w:val="24"/>
+                <w:szCs w:val="24"/>
+              </w:rPr>
+              <w:t>分图题，且</w:t>
+            </w:r>
+            <w:proofErr w:type="gramStart"/>
+            <w:r>
+              <w:rPr>
+                <w:rFonts w:ascii="宋体" w:eastAsia="宋体" w:hAnsi="宋体" w:hint="eastAsia"/>
+                <w:sz w:val="24"/>
+                <w:szCs w:val="24"/>
+              </w:rPr>
+              <w:t>分图题应</w:t>
+            </w:r>
+            <w:proofErr w:type="gramEnd"/>
+            <w:r>
+              <w:rPr>
+                <w:rFonts w:ascii="宋体" w:eastAsia="宋体" w:hAnsi="宋体" w:hint="eastAsia"/>
+                <w:sz w:val="24"/>
+                <w:szCs w:val="24"/>
+              </w:rPr>
+              <w:t>位于图下方，如P</w:t>
             </w:r>
             <w:r>
               <w:rPr>
@@ -4908,6 +6746,7 @@
                 <w:b/>
                 <w:szCs w:val="21"/>
               </w:rPr>
+              <w:lastRenderedPageBreak/>
               <w:t>指导教师（小组）意见</w:t>
             </w:r>
             <w:r>
@@ -5443,6 +7282,7 @@
   <w:style w:type="character" w:default="1" w:styleId="a0">
     <w:name w:val="Default Paragraph Font"/>
     <w:uiPriority w:val="1"/>
+    <w:semiHidden/>
     <w:unhideWhenUsed/>
   </w:style>
   <w:style w:type="table" w:default="1" w:styleId="a1">

</xml_diff>